<commit_message>
correction, ajout de fonctionnalite de production des articles
</commit_message>
<xml_diff>
--- a/app/core/documents/FICHE_DE_DECHARGE_DE_FONDS.docx
+++ b/app/core/documents/FICHE_DE_DECHARGE_DE_FONDS.docx
@@ -7,30 +7,46 @@
         <w:pStyle w:val="Titre1"/>
       </w:pPr>
       <w:r>
-        <w:t>FICHE DE DÉCHARGE DE FOND</w:t>
-      </w:r>
-      <w:r>
-        <w:t>S</w:t>
-      </w:r>
-    </w:p>
-    <w:p>
-      <w:pPr>
-        <w:rPr>
-          <w:rFonts w:ascii="Times New Roman" w:hAnsi="Times New Roman" w:cs="Times New Roman"/>
-        </w:rPr>
-      </w:pPr>
-    </w:p>
-    <w:p>
-      <w:pPr>
-        <w:rPr>
-          <w:rFonts w:ascii="Times New Roman" w:hAnsi="Times New Roman" w:cs="Times New Roman"/>
-        </w:rPr>
-      </w:pPr>
-      <w:r>
-        <w:rPr>
-          <w:rFonts w:ascii="Times New Roman" w:hAnsi="Times New Roman" w:cs="Times New Roman"/>
-        </w:rPr>
-        <w:t xml:space="preserve">N° de la Décharge            : </w:t>
+        <w:t>DÉCHARGE</w:t>
+      </w:r>
+    </w:p>
+    <w:p>
+      <w:pPr>
+        <w:rPr>
+          <w:rFonts w:ascii="Times New Roman" w:hAnsi="Times New Roman" w:cs="Times New Roman"/>
+        </w:rPr>
+      </w:pPr>
+    </w:p>
+    <w:p>
+      <w:pPr>
+        <w:rPr>
+          <w:rFonts w:ascii="Times New Roman" w:hAnsi="Times New Roman" w:cs="Times New Roman"/>
+          <w:lang w:val="fr-FR"/>
+        </w:rPr>
+      </w:pPr>
+      <w:r>
+        <w:rPr>
+          <w:rFonts w:ascii="Times New Roman" w:hAnsi="Times New Roman" w:cs="Times New Roman"/>
+        </w:rPr>
+        <w:t>N° de la Décharge</w:t>
+      </w:r>
+      <w:r>
+        <w:rPr>
+          <w:rFonts w:ascii="Times New Roman" w:hAnsi="Times New Roman" w:cs="Times New Roman"/>
+        </w:rPr>
+        <w:tab/>
+      </w:r>
+      <w:r>
+        <w:rPr>
+          <w:rFonts w:ascii="Times New Roman" w:hAnsi="Times New Roman" w:cs="Times New Roman"/>
+        </w:rPr>
+        <w:tab/>
+      </w:r>
+      <w:r>
+        <w:rPr>
+          <w:rFonts w:ascii="Times New Roman" w:hAnsi="Times New Roman" w:cs="Times New Roman"/>
+        </w:rPr>
+        <w:t xml:space="preserve">: </w:t>
       </w:r>
       <w:r>
         <w:rPr>
@@ -42,7 +58,7 @@
         <w:rPr>
           <w:rFonts w:ascii="Times New Roman" w:hAnsi="Times New Roman" w:cs="Times New Roman"/>
         </w:rPr>
-        <w:t>id_decharge</w:t>
+        <w:t>client_id</w:t>
       </w:r>
       <w:r>
         <w:rPr>
@@ -53,6 +69,87 @@
       <w:r>
         <w:rPr>
           <w:rFonts w:ascii="Times New Roman" w:hAnsi="Times New Roman" w:cs="Times New Roman"/>
+          <w:lang w:val="fr-FR"/>
+        </w:rPr>
+        <w:t>/</w:t>
+      </w:r>
+      <w:r>
+        <w:rPr>
+          <w:rFonts w:ascii="Times New Roman" w:hAnsi="Times New Roman" w:cs="Times New Roman"/>
+        </w:rPr>
+        <w:t xml:space="preserve"> </w:t>
+      </w:r>
+      <w:r>
+        <w:rPr>
+          <w:rFonts w:ascii="Times New Roman" w:hAnsi="Times New Roman" w:cs="Times New Roman"/>
+        </w:rPr>
+        <w:t>[</w:t>
+      </w:r>
+      <w:r>
+        <w:rPr>
+          <w:rFonts w:ascii="Times New Roman" w:hAnsi="Times New Roman" w:cs="Times New Roman"/>
+          <w:lang w:val="fr-FR"/>
+        </w:rPr>
+        <w:t>numero_ordre_client</w:t>
+      </w:r>
+      <w:r>
+        <w:rPr>
+          <w:rFonts w:ascii="Times New Roman" w:hAnsi="Times New Roman" w:cs="Times New Roman"/>
+        </w:rPr>
+        <w:t>]</w:t>
+      </w:r>
+    </w:p>
+    <w:p>
+      <w:pPr>
+        <w:rPr>
+          <w:rFonts w:ascii="Times New Roman" w:hAnsi="Times New Roman" w:cs="Times New Roman"/>
+        </w:rPr>
+      </w:pPr>
+      <w:r>
+        <w:rPr>
+          <w:rFonts w:ascii="Times New Roman" w:hAnsi="Times New Roman" w:cs="Times New Roman"/>
+        </w:rPr>
+        <w:t>Date de la Décharge</w:t>
+      </w:r>
+      <w:r>
+        <w:rPr>
+          <w:rFonts w:ascii="Times New Roman" w:hAnsi="Times New Roman" w:cs="Times New Roman"/>
+        </w:rPr>
+        <w:tab/>
+      </w:r>
+      <w:r>
+        <w:rPr>
+          <w:rFonts w:ascii="Times New Roman" w:hAnsi="Times New Roman" w:cs="Times New Roman"/>
+        </w:rPr>
+        <w:tab/>
+      </w:r>
+      <w:r>
+        <w:rPr>
+          <w:rFonts w:ascii="Times New Roman" w:hAnsi="Times New Roman" w:cs="Times New Roman"/>
+        </w:rPr>
+        <w:t xml:space="preserve">: </w:t>
+      </w:r>
+      <w:r>
+        <w:rPr>
+          <w:rFonts w:ascii="Times New Roman" w:hAnsi="Times New Roman" w:cs="Times New Roman"/>
+        </w:rPr>
+        <w:t>[</w:t>
+      </w:r>
+      <w:r>
+        <w:rPr>
+          <w:rFonts w:ascii="Times New Roman" w:hAnsi="Times New Roman" w:cs="Times New Roman"/>
+        </w:rPr>
+        <w:t>date_decharge_formatted</w:t>
+      </w:r>
+      <w:r>
+        <w:rPr>
+          <w:rFonts w:ascii="Times New Roman" w:hAnsi="Times New Roman" w:cs="Times New Roman"/>
+        </w:rPr>
+        <w:t>]</w:t>
+      </w:r>
+      <w:r>
+        <w:rPr>
+          <w:rFonts w:ascii="Times New Roman" w:hAnsi="Times New Roman" w:cs="Times New Roman"/>
         </w:rPr>
         <w:t xml:space="preserve">  </w:t>
       </w:r>
@@ -66,8 +163,36 @@
       <w:r>
         <w:rPr>
           <w:rFonts w:ascii="Times New Roman" w:hAnsi="Times New Roman" w:cs="Times New Roman"/>
-        </w:rPr>
-        <w:t xml:space="preserve">Date de la Décharge          : </w:t>
+          <w:lang w:val="fr-FR"/>
+        </w:rPr>
+        <w:t>Département</w:t>
+      </w:r>
+      <w:r>
+        <w:rPr>
+          <w:rFonts w:ascii="Times New Roman" w:hAnsi="Times New Roman" w:cs="Times New Roman"/>
+          <w:lang w:val="fr-FR"/>
+        </w:rPr>
+        <w:tab/>
+      </w:r>
+      <w:r>
+        <w:rPr>
+          <w:rFonts w:ascii="Times New Roman" w:hAnsi="Times New Roman" w:cs="Times New Roman"/>
+          <w:lang w:val="fr-FR"/>
+        </w:rPr>
+        <w:tab/>
+      </w:r>
+      <w:r>
+        <w:rPr>
+          <w:rFonts w:ascii="Times New Roman" w:hAnsi="Times New Roman" w:cs="Times New Roman"/>
+          <w:lang w:val="fr-FR"/>
+        </w:rPr>
+        <w:tab/>
+      </w:r>
+      <w:r>
+        <w:rPr>
+          <w:rFonts w:ascii="Times New Roman" w:hAnsi="Times New Roman" w:cs="Times New Roman"/>
+        </w:rPr>
+        <w:t xml:space="preserve">: </w:t>
       </w:r>
       <w:r>
         <w:rPr>
@@ -79,7 +204,7 @@
         <w:rPr>
           <w:rFonts w:ascii="Times New Roman" w:hAnsi="Times New Roman" w:cs="Times New Roman"/>
         </w:rPr>
-        <w:t>date_decharge_formatted</w:t>
+        <w:t>mag_decharge</w:t>
       </w:r>
       <w:r>
         <w:rPr>
@@ -104,7 +229,25 @@
         <w:rPr>
           <w:rFonts w:ascii="Times New Roman" w:hAnsi="Times New Roman" w:cs="Times New Roman"/>
         </w:rPr>
-        <w:t xml:space="preserve">Magasin / Service            : </w:t>
+        <w:t>Type de Décharge</w:t>
+      </w:r>
+      <w:r>
+        <w:rPr>
+          <w:rFonts w:ascii="Times New Roman" w:hAnsi="Times New Roman" w:cs="Times New Roman"/>
+        </w:rPr>
+        <w:tab/>
+      </w:r>
+      <w:r>
+        <w:rPr>
+          <w:rFonts w:ascii="Times New Roman" w:hAnsi="Times New Roman" w:cs="Times New Roman"/>
+        </w:rPr>
+        <w:tab/>
+      </w:r>
+      <w:r>
+        <w:rPr>
+          <w:rFonts w:ascii="Times New Roman" w:hAnsi="Times New Roman" w:cs="Times New Roman"/>
+        </w:rPr>
+        <w:t xml:space="preserve">: </w:t>
       </w:r>
       <w:r>
         <w:rPr>
@@ -116,7 +259,7 @@
         <w:rPr>
           <w:rFonts w:ascii="Times New Roman" w:hAnsi="Times New Roman" w:cs="Times New Roman"/>
         </w:rPr>
-        <w:t>mag_decharge</w:t>
+        <w:t>type_decharge</w:t>
       </w:r>
       <w:r>
         <w:rPr>
@@ -124,6 +267,200 @@
         </w:rPr>
         <w:t>]</w:t>
       </w:r>
+    </w:p>
+    <w:p>
+      <w:pPr>
+        <w:rPr>
+          <w:rFonts w:ascii="Times New Roman" w:hAnsi="Times New Roman" w:cs="Times New Roman"/>
+        </w:rPr>
+      </w:pPr>
+    </w:p>
+    <w:p>
+      <w:pPr>
+        <w:pStyle w:val="Titre2"/>
+        <w:rPr>
+          <w:lang w:val="fr-FR"/>
+        </w:rPr>
+      </w:pPr>
+      <w:r>
+        <w:t>INFORMATIONS SUR L</w:t>
+      </w:r>
+      <w:r>
+        <w:rPr>
+          <w:lang w:val="fr-FR"/>
+        </w:rPr>
+        <w:t>’</w:t>
+      </w:r>
+      <w:r>
+        <w:t>É</w:t>
+      </w:r>
+      <w:r>
+        <w:rPr>
+          <w:lang w:val="fr-FR"/>
+        </w:rPr>
+        <w:t>METTEUR</w:t>
+      </w:r>
+    </w:p>
+    <w:p>
+      <w:pPr>
+        <w:rPr>
+          <w:rFonts w:ascii="Times New Roman" w:hAnsi="Times New Roman" w:cs="Times New Roman"/>
+        </w:rPr>
+      </w:pPr>
+      <w:r>
+        <w:rPr>
+          <w:rFonts w:ascii="Times New Roman" w:hAnsi="Times New Roman" w:cs="Times New Roman"/>
+        </w:rPr>
+        <w:t>Nom</w:t>
+      </w:r>
+      <w:r>
+        <w:rPr>
+          <w:rFonts w:ascii="Times New Roman" w:hAnsi="Times New Roman" w:cs="Times New Roman"/>
+        </w:rPr>
+        <w:tab/>
+      </w:r>
+      <w:r>
+        <w:rPr>
+          <w:rFonts w:ascii="Times New Roman" w:hAnsi="Times New Roman" w:cs="Times New Roman"/>
+        </w:rPr>
+        <w:tab/>
+      </w:r>
+      <w:r>
+        <w:rPr>
+          <w:rFonts w:ascii="Times New Roman" w:hAnsi="Times New Roman" w:cs="Times New Roman"/>
+        </w:rPr>
+        <w:tab/>
+      </w:r>
+      <w:r>
+        <w:rPr>
+          <w:rFonts w:ascii="Times New Roman" w:hAnsi="Times New Roman" w:cs="Times New Roman"/>
+        </w:rPr>
+        <w:tab/>
+      </w:r>
+      <w:r>
+        <w:rPr>
+          <w:rFonts w:ascii="Times New Roman" w:hAnsi="Times New Roman" w:cs="Times New Roman"/>
+        </w:rPr>
+        <w:t xml:space="preserve">: </w:t>
+      </w:r>
+      <w:r>
+        <w:rPr>
+          <w:rFonts w:ascii="Times New Roman" w:hAnsi="Times New Roman" w:cs="Times New Roman"/>
+        </w:rPr>
+        <w:t>[</w:t>
+      </w:r>
+      <w:r>
+        <w:rPr>
+          <w:rFonts w:ascii="Times New Roman" w:hAnsi="Times New Roman" w:cs="Times New Roman"/>
+        </w:rPr>
+        <w:t>nom_dechargeur</w:t>
+      </w:r>
+      <w:r>
+        <w:rPr>
+          <w:rFonts w:ascii="Times New Roman" w:hAnsi="Times New Roman" w:cs="Times New Roman"/>
+        </w:rPr>
+        <w:t>]</w:t>
+      </w:r>
+    </w:p>
+    <w:p>
+      <w:pPr>
+        <w:rPr>
+          <w:rFonts w:ascii="Times New Roman" w:hAnsi="Times New Roman" w:cs="Times New Roman"/>
+          <w:lang w:val="fr-FR"/>
+        </w:rPr>
+      </w:pPr>
+      <w:r>
+        <w:rPr>
+          <w:rFonts w:ascii="Times New Roman" w:hAnsi="Times New Roman" w:cs="Times New Roman"/>
+          <w:lang w:val="fr-FR"/>
+        </w:rPr>
+        <w:t>Prénom (s)</w:t>
+      </w:r>
+      <w:r>
+        <w:rPr>
+          <w:rFonts w:ascii="Times New Roman" w:hAnsi="Times New Roman" w:cs="Times New Roman"/>
+          <w:lang w:val="fr-FR"/>
+        </w:rPr>
+        <w:tab/>
+      </w:r>
+      <w:r>
+        <w:rPr>
+          <w:rFonts w:ascii="Times New Roman" w:hAnsi="Times New Roman" w:cs="Times New Roman"/>
+          <w:lang w:val="fr-FR"/>
+        </w:rPr>
+        <w:tab/>
+      </w:r>
+      <w:r>
+        <w:rPr>
+          <w:rFonts w:ascii="Times New Roman" w:hAnsi="Times New Roman" w:cs="Times New Roman"/>
+          <w:lang w:val="fr-FR"/>
+        </w:rPr>
+        <w:tab/>
+        <w:t>: [prenom_dechargeur]</w:t>
+      </w:r>
+    </w:p>
+    <w:p>
+      <w:pPr>
+        <w:rPr>
+          <w:rFonts w:ascii="Times New Roman" w:hAnsi="Times New Roman" w:cs="Times New Roman"/>
+        </w:rPr>
+      </w:pPr>
+      <w:r>
+        <w:rPr>
+          <w:rFonts w:ascii="Times New Roman" w:hAnsi="Times New Roman" w:cs="Times New Roman"/>
+          <w:lang w:val="fr-FR"/>
+        </w:rPr>
+        <w:t>CNIB</w:t>
+      </w:r>
+      <w:r>
+        <w:rPr>
+          <w:rFonts w:ascii="Times New Roman" w:hAnsi="Times New Roman" w:cs="Times New Roman"/>
+        </w:rPr>
+        <w:tab/>
+      </w:r>
+      <w:r>
+        <w:rPr>
+          <w:rFonts w:ascii="Times New Roman" w:hAnsi="Times New Roman" w:cs="Times New Roman"/>
+        </w:rPr>
+        <w:tab/>
+      </w:r>
+      <w:r>
+        <w:rPr>
+          <w:rFonts w:ascii="Times New Roman" w:hAnsi="Times New Roman" w:cs="Times New Roman"/>
+        </w:rPr>
+        <w:tab/>
+      </w:r>
+      <w:r>
+        <w:rPr>
+          <w:rFonts w:ascii="Times New Roman" w:hAnsi="Times New Roman" w:cs="Times New Roman"/>
+        </w:rPr>
+        <w:tab/>
+      </w:r>
+      <w:r>
+        <w:rPr>
+          <w:rFonts w:ascii="Times New Roman" w:hAnsi="Times New Roman" w:cs="Times New Roman"/>
+        </w:rPr>
+        <w:t xml:space="preserve">: </w:t>
+      </w:r>
+      <w:r>
+        <w:rPr>
+          <w:rFonts w:ascii="Times New Roman" w:hAnsi="Times New Roman" w:cs="Times New Roman"/>
+        </w:rPr>
+        <w:t>[</w:t>
+      </w:r>
+      <w:r>
+        <w:rPr>
+          <w:rFonts w:ascii="Times New Roman" w:hAnsi="Times New Roman" w:cs="Times New Roman"/>
+          <w:lang w:val="fr-FR"/>
+        </w:rPr>
+        <w:t>cnib_dechargeur</w:t>
+      </w:r>
+      <w:r>
+        <w:rPr>
+          <w:rFonts w:ascii="Times New Roman" w:hAnsi="Times New Roman" w:cs="Times New Roman"/>
+        </w:rPr>
+        <w:t>]</w:t>
+      </w:r>
       <w:r>
         <w:rPr>
           <w:rFonts w:ascii="Times New Roman" w:hAnsi="Times New Roman" w:cs="Times New Roman"/>
@@ -140,8 +477,88 @@
       <w:r>
         <w:rPr>
           <w:rFonts w:ascii="Times New Roman" w:hAnsi="Times New Roman" w:cs="Times New Roman"/>
-        </w:rPr>
-        <w:t xml:space="preserve">Type de Décharge             : </w:t>
+          <w:lang w:val="fr-FR"/>
+        </w:rPr>
+        <w:t>Poste occupé</w:t>
+      </w:r>
+      <w:r>
+        <w:rPr>
+          <w:rFonts w:ascii="Times New Roman" w:hAnsi="Times New Roman" w:cs="Times New Roman"/>
+          <w:lang w:val="fr-FR"/>
+        </w:rPr>
+        <w:tab/>
+      </w:r>
+      <w:r>
+        <w:rPr>
+          <w:rFonts w:ascii="Times New Roman" w:hAnsi="Times New Roman" w:cs="Times New Roman"/>
+          <w:lang w:val="fr-FR"/>
+        </w:rPr>
+        <w:tab/>
+      </w:r>
+      <w:r>
+        <w:rPr>
+          <w:rFonts w:ascii="Times New Roman" w:hAnsi="Times New Roman" w:cs="Times New Roman"/>
+        </w:rPr>
+        <w:tab/>
+      </w:r>
+      <w:r>
+        <w:rPr>
+          <w:rFonts w:ascii="Times New Roman" w:hAnsi="Times New Roman" w:cs="Times New Roman"/>
+        </w:rPr>
+        <w:t xml:space="preserve">: </w:t>
+      </w:r>
+      <w:r>
+        <w:rPr>
+          <w:rFonts w:ascii="Times New Roman" w:hAnsi="Times New Roman" w:cs="Times New Roman"/>
+          <w:lang w:val="fr-FR"/>
+        </w:rPr>
+        <w:t>[poste_dechargeur</w:t>
+      </w:r>
+      <w:r>
+        <w:rPr>
+          <w:rFonts w:ascii="Times New Roman" w:hAnsi="Times New Roman" w:cs="Times New Roman"/>
+        </w:rPr>
+        <w:t>]</w:t>
+      </w:r>
+    </w:p>
+    <w:p>
+      <w:pPr>
+        <w:rPr>
+          <w:rFonts w:ascii="Times New Roman" w:hAnsi="Times New Roman" w:cs="Times New Roman"/>
+        </w:rPr>
+      </w:pPr>
+    </w:p>
+    <w:p>
+      <w:pPr>
+        <w:pStyle w:val="Titre2"/>
+      </w:pPr>
+      <w:r>
+        <w:t>INFORMATIONS SUR LE CLIENT / BÉNÉFICIAIRE</w:t>
+      </w:r>
+    </w:p>
+    <w:p>
+      <w:pPr>
+        <w:rPr>
+          <w:rFonts w:ascii="Times New Roman" w:hAnsi="Times New Roman" w:cs="Times New Roman"/>
+        </w:rPr>
+      </w:pPr>
+      <w:r>
+        <w:rPr>
+          <w:rFonts w:ascii="Times New Roman" w:hAnsi="Times New Roman" w:cs="Times New Roman"/>
+        </w:rPr>
+        <w:t xml:space="preserve">Nom et Prénoms du client </w:t>
+      </w:r>
+      <w:r>
+        <w:rPr>
+          <w:rFonts w:ascii="Times New Roman" w:hAnsi="Times New Roman" w:cs="Times New Roman"/>
+        </w:rPr>
+        <w:tab/>
+      </w:r>
+      <w:r>
+        <w:rPr>
+          <w:rFonts w:ascii="Times New Roman" w:hAnsi="Times New Roman" w:cs="Times New Roman"/>
+        </w:rPr>
+        <w:t xml:space="preserve">: </w:t>
       </w:r>
       <w:r>
         <w:rPr>
@@ -153,7 +570,7 @@
         <w:rPr>
           <w:rFonts w:ascii="Times New Roman" w:hAnsi="Times New Roman" w:cs="Times New Roman"/>
         </w:rPr>
-        <w:t>type_decharge</w:t>
+        <w:t>nom_prenom_client</w:t>
       </w:r>
       <w:r>
         <w:rPr>
@@ -161,6 +578,269 @@
         </w:rPr>
         <w:t>]</w:t>
       </w:r>
+      <w:r>
+        <w:rPr>
+          <w:rFonts w:ascii="Times New Roman" w:hAnsi="Times New Roman" w:cs="Times New Roman"/>
+        </w:rPr>
+        <w:t xml:space="preserve">  </w:t>
+      </w:r>
+    </w:p>
+    <w:p>
+      <w:pPr>
+        <w:rPr>
+          <w:rFonts w:ascii="Times New Roman" w:hAnsi="Times New Roman" w:cs="Times New Roman"/>
+        </w:rPr>
+      </w:pPr>
+      <w:r>
+        <w:rPr>
+          <w:rFonts w:ascii="Times New Roman" w:hAnsi="Times New Roman" w:cs="Times New Roman"/>
+          <w:lang w:val="fr-FR"/>
+        </w:rPr>
+        <w:t>Téléphone client</w:t>
+      </w:r>
+      <w:r>
+        <w:rPr>
+          <w:rFonts w:ascii="Times New Roman" w:hAnsi="Times New Roman" w:cs="Times New Roman"/>
+        </w:rPr>
+        <w:tab/>
+      </w:r>
+      <w:r>
+        <w:rPr>
+          <w:rFonts w:ascii="Times New Roman" w:hAnsi="Times New Roman" w:cs="Times New Roman"/>
+        </w:rPr>
+        <w:tab/>
+      </w:r>
+      <w:r>
+        <w:rPr>
+          <w:rFonts w:ascii="Times New Roman" w:hAnsi="Times New Roman" w:cs="Times New Roman"/>
+        </w:rPr>
+        <w:t xml:space="preserve">: </w:t>
+      </w:r>
+      <w:r>
+        <w:rPr>
+          <w:rFonts w:ascii="Times New Roman" w:hAnsi="Times New Roman" w:cs="Times New Roman"/>
+        </w:rPr>
+        <w:t>[</w:t>
+      </w:r>
+      <w:r>
+        <w:rPr>
+          <w:rFonts w:ascii="Times New Roman" w:hAnsi="Times New Roman" w:cs="Times New Roman"/>
+        </w:rPr>
+        <w:t>tel_clt</w:t>
+      </w:r>
+      <w:r>
+        <w:rPr>
+          <w:rFonts w:ascii="Times New Roman" w:hAnsi="Times New Roman" w:cs="Times New Roman"/>
+        </w:rPr>
+        <w:t>]</w:t>
+      </w:r>
+    </w:p>
+    <w:p>
+      <w:pPr>
+        <w:rPr>
+          <w:rFonts w:ascii="Times New Roman" w:hAnsi="Times New Roman" w:cs="Times New Roman"/>
+          <w:lang w:val="fr-FR"/>
+        </w:rPr>
+      </w:pPr>
+      <w:r>
+        <w:rPr>
+          <w:rFonts w:ascii="Times New Roman" w:hAnsi="Times New Roman" w:cs="Times New Roman"/>
+          <w:lang w:val="fr-FR"/>
+        </w:rPr>
+        <w:t>Type pièce</w:t>
+      </w:r>
+      <w:r>
+        <w:rPr>
+          <w:rFonts w:ascii="Times New Roman" w:hAnsi="Times New Roman" w:cs="Times New Roman"/>
+          <w:lang w:val="fr-FR"/>
+        </w:rPr>
+        <w:tab/>
+      </w:r>
+      <w:r>
+        <w:rPr>
+          <w:rFonts w:ascii="Times New Roman" w:hAnsi="Times New Roman" w:cs="Times New Roman"/>
+          <w:lang w:val="fr-FR"/>
+        </w:rPr>
+        <w:tab/>
+      </w:r>
+      <w:r>
+        <w:rPr>
+          <w:rFonts w:ascii="Times New Roman" w:hAnsi="Times New Roman" w:cs="Times New Roman"/>
+          <w:lang w:val="fr-FR"/>
+        </w:rPr>
+        <w:tab/>
+        <w:t>: [</w:t>
+      </w:r>
+      <w:proofErr w:type="spellStart"/>
+      <w:r>
+        <w:rPr>
+          <w:rFonts w:ascii="Times New Roman" w:hAnsi="Times New Roman" w:cs="Times New Roman"/>
+          <w:lang w:val="fr-FR"/>
+        </w:rPr>
+        <w:t>type_piece</w:t>
+      </w:r>
+      <w:proofErr w:type="spellEnd"/>
+      <w:r>
+        <w:rPr>
+          <w:rFonts w:ascii="Times New Roman" w:hAnsi="Times New Roman" w:cs="Times New Roman"/>
+          <w:lang w:val="fr-FR"/>
+        </w:rPr>
+        <w:t>]</w:t>
+      </w:r>
+    </w:p>
+    <w:p>
+      <w:pPr>
+        <w:rPr>
+          <w:rFonts w:ascii="Times New Roman" w:hAnsi="Times New Roman" w:cs="Times New Roman"/>
+          <w:lang w:val="fr-FR"/>
+        </w:rPr>
+      </w:pPr>
+      <w:r>
+        <w:rPr>
+          <w:rFonts w:ascii="Times New Roman" w:hAnsi="Times New Roman" w:cs="Times New Roman"/>
+          <w:lang w:val="fr-FR"/>
+        </w:rPr>
+        <w:t>Référence de la pièce</w:t>
+      </w:r>
+      <w:r>
+        <w:rPr>
+          <w:rFonts w:ascii="Times New Roman" w:hAnsi="Times New Roman" w:cs="Times New Roman"/>
+          <w:lang w:val="fr-FR"/>
+        </w:rPr>
+        <w:tab/>
+      </w:r>
+      <w:r>
+        <w:rPr>
+          <w:rFonts w:ascii="Times New Roman" w:hAnsi="Times New Roman" w:cs="Times New Roman"/>
+          <w:lang w:val="fr-FR"/>
+        </w:rPr>
+        <w:tab/>
+        <w:t>: [</w:t>
+      </w:r>
+      <w:proofErr w:type="spellStart"/>
+      <w:r>
+        <w:rPr>
+          <w:rFonts w:ascii="Times New Roman" w:hAnsi="Times New Roman" w:cs="Times New Roman"/>
+          <w:lang w:val="fr-FR"/>
+        </w:rPr>
+        <w:t>reference_piece</w:t>
+      </w:r>
+      <w:proofErr w:type="spellEnd"/>
+      <w:r>
+        <w:rPr>
+          <w:rFonts w:ascii="Times New Roman" w:hAnsi="Times New Roman" w:cs="Times New Roman"/>
+          <w:lang w:val="fr-FR"/>
+        </w:rPr>
+        <w:t>]</w:t>
+      </w:r>
+    </w:p>
+    <w:p>
+      <w:pPr>
+        <w:rPr>
+          <w:rFonts w:ascii="Times New Roman" w:hAnsi="Times New Roman" w:cs="Times New Roman"/>
+          <w:lang w:val="fr-FR"/>
+        </w:rPr>
+      </w:pPr>
+      <w:r>
+        <w:rPr>
+          <w:rFonts w:ascii="Times New Roman" w:hAnsi="Times New Roman" w:cs="Times New Roman"/>
+          <w:lang w:val="fr-FR"/>
+        </w:rPr>
+        <w:t>Délivré le</w:t>
+      </w:r>
+      <w:r>
+        <w:rPr>
+          <w:rFonts w:ascii="Times New Roman" w:hAnsi="Times New Roman" w:cs="Times New Roman"/>
+          <w:lang w:val="fr-FR"/>
+        </w:rPr>
+        <w:tab/>
+      </w:r>
+      <w:r>
+        <w:rPr>
+          <w:rFonts w:ascii="Times New Roman" w:hAnsi="Times New Roman" w:cs="Times New Roman"/>
+          <w:lang w:val="fr-FR"/>
+        </w:rPr>
+        <w:tab/>
+      </w:r>
+      <w:r>
+        <w:rPr>
+          <w:rFonts w:ascii="Times New Roman" w:hAnsi="Times New Roman" w:cs="Times New Roman"/>
+          <w:lang w:val="fr-FR"/>
+        </w:rPr>
+        <w:tab/>
+        <w:t>: [</w:t>
+      </w:r>
+      <w:proofErr w:type="spellStart"/>
+      <w:r>
+        <w:rPr>
+          <w:rFonts w:ascii="Times New Roman" w:hAnsi="Times New Roman" w:cs="Times New Roman"/>
+          <w:lang w:val="fr-FR"/>
+        </w:rPr>
+        <w:t>delivre_le</w:t>
+      </w:r>
+      <w:proofErr w:type="spellEnd"/>
+      <w:r>
+        <w:rPr>
+          <w:rFonts w:ascii="Times New Roman" w:hAnsi="Times New Roman" w:cs="Times New Roman"/>
+          <w:lang w:val="fr-FR"/>
+        </w:rPr>
+        <w:t>]</w:t>
+      </w:r>
+    </w:p>
+    <w:p>
+      <w:pPr>
+        <w:rPr>
+          <w:rFonts w:ascii="Times New Roman" w:hAnsi="Times New Roman" w:cs="Times New Roman"/>
+          <w:lang w:val="fr-FR"/>
+        </w:rPr>
+      </w:pPr>
+      <w:proofErr w:type="gramStart"/>
+      <w:r>
+        <w:rPr>
+          <w:rFonts w:ascii="Times New Roman" w:hAnsi="Times New Roman" w:cs="Times New Roman"/>
+          <w:lang w:val="fr-FR"/>
+        </w:rPr>
+        <w:t>Expire le</w:t>
+      </w:r>
+      <w:proofErr w:type="gramEnd"/>
+      <w:r>
+        <w:rPr>
+          <w:rFonts w:ascii="Times New Roman" w:hAnsi="Times New Roman" w:cs="Times New Roman"/>
+          <w:lang w:val="fr-FR"/>
+        </w:rPr>
+        <w:tab/>
+      </w:r>
+      <w:r>
+        <w:rPr>
+          <w:rFonts w:ascii="Times New Roman" w:hAnsi="Times New Roman" w:cs="Times New Roman"/>
+          <w:lang w:val="fr-FR"/>
+        </w:rPr>
+        <w:tab/>
+      </w:r>
+      <w:r>
+        <w:rPr>
+          <w:rFonts w:ascii="Times New Roman" w:hAnsi="Times New Roman" w:cs="Times New Roman"/>
+          <w:lang w:val="fr-FR"/>
+        </w:rPr>
+        <w:tab/>
+        <w:t>: [</w:t>
+      </w:r>
+      <w:proofErr w:type="spellStart"/>
+      <w:r>
+        <w:rPr>
+          <w:rFonts w:ascii="Times New Roman" w:hAnsi="Times New Roman" w:cs="Times New Roman"/>
+          <w:lang w:val="fr-FR"/>
+        </w:rPr>
+        <w:t>expire_le</w:t>
+      </w:r>
+      <w:proofErr w:type="spellEnd"/>
+      <w:r>
+        <w:rPr>
+          <w:rFonts w:ascii="Times New Roman" w:hAnsi="Times New Roman" w:cs="Times New Roman"/>
+          <w:lang w:val="fr-FR"/>
+        </w:rPr>
+        <w:t>]</w:t>
+      </w:r>
     </w:p>
     <w:p>
       <w:pPr>
@@ -174,20 +854,38 @@
         <w:pStyle w:val="Titre2"/>
       </w:pPr>
       <w:r>
-        <w:t>INFORMATIONS SUR LE DÉCHARGEUR</w:t>
-      </w:r>
-    </w:p>
-    <w:p>
-      <w:pPr>
-        <w:rPr>
-          <w:rFonts w:ascii="Times New Roman" w:hAnsi="Times New Roman" w:cs="Times New Roman"/>
-        </w:rPr>
-      </w:pPr>
-      <w:r>
-        <w:rPr>
-          <w:rFonts w:ascii="Times New Roman" w:hAnsi="Times New Roman" w:cs="Times New Roman"/>
-        </w:rPr>
-        <w:t xml:space="preserve">Nom et Prénoms               : </w:t>
+        <w:t>DÉTAILS DE LA TRANSACTION</w:t>
+      </w:r>
+    </w:p>
+    <w:p>
+      <w:pPr>
+        <w:rPr>
+          <w:rFonts w:ascii="Times New Roman" w:hAnsi="Times New Roman" w:cs="Times New Roman"/>
+        </w:rPr>
+      </w:pPr>
+      <w:r>
+        <w:rPr>
+          <w:rFonts w:ascii="Times New Roman" w:hAnsi="Times New Roman" w:cs="Times New Roman"/>
+        </w:rPr>
+        <w:t>Montant déchargé</w:t>
+      </w:r>
+      <w:r>
+        <w:rPr>
+          <w:rFonts w:ascii="Times New Roman" w:hAnsi="Times New Roman" w:cs="Times New Roman"/>
+        </w:rPr>
+        <w:tab/>
+      </w:r>
+      <w:r>
+        <w:rPr>
+          <w:rFonts w:ascii="Times New Roman" w:hAnsi="Times New Roman" w:cs="Times New Roman"/>
+        </w:rPr>
+        <w:tab/>
+      </w:r>
+      <w:r>
+        <w:rPr>
+          <w:rFonts w:ascii="Times New Roman" w:hAnsi="Times New Roman" w:cs="Times New Roman"/>
+        </w:rPr>
+        <w:t xml:space="preserve">: </w:t>
       </w:r>
       <w:r>
         <w:rPr>
@@ -199,7 +897,7 @@
         <w:rPr>
           <w:rFonts w:ascii="Times New Roman" w:hAnsi="Times New Roman" w:cs="Times New Roman"/>
         </w:rPr>
-        <w:t>nom_prenom_dechargeur</w:t>
+        <w:t>montant</w:t>
       </w:r>
       <w:r>
         <w:rPr>
@@ -211,6 +909,61 @@
         <w:rPr>
           <w:rFonts w:ascii="Times New Roman" w:hAnsi="Times New Roman" w:cs="Times New Roman"/>
         </w:rPr>
+        <w:t xml:space="preserve"> F CFA  </w:t>
+      </w:r>
+    </w:p>
+    <w:p>
+      <w:pPr>
+        <w:rPr>
+          <w:rFonts w:ascii="Times New Roman" w:hAnsi="Times New Roman" w:cs="Times New Roman"/>
+        </w:rPr>
+      </w:pPr>
+      <w:r>
+        <w:rPr>
+          <w:rFonts w:ascii="Times New Roman" w:hAnsi="Times New Roman" w:cs="Times New Roman"/>
+        </w:rPr>
+        <w:t>Motif de la décharge</w:t>
+      </w:r>
+      <w:r>
+        <w:rPr>
+          <w:rFonts w:ascii="Times New Roman" w:hAnsi="Times New Roman" w:cs="Times New Roman"/>
+        </w:rPr>
+        <w:tab/>
+      </w:r>
+      <w:r>
+        <w:rPr>
+          <w:rFonts w:ascii="Times New Roman" w:hAnsi="Times New Roman" w:cs="Times New Roman"/>
+        </w:rPr>
+        <w:tab/>
+      </w:r>
+      <w:r>
+        <w:rPr>
+          <w:rFonts w:ascii="Times New Roman" w:hAnsi="Times New Roman" w:cs="Times New Roman"/>
+        </w:rPr>
+        <w:t xml:space="preserve">: </w:t>
+      </w:r>
+      <w:r>
+        <w:rPr>
+          <w:rFonts w:ascii="Times New Roman" w:hAnsi="Times New Roman" w:cs="Times New Roman"/>
+        </w:rPr>
+        <w:t>[</w:t>
+      </w:r>
+      <w:r>
+        <w:rPr>
+          <w:rFonts w:ascii="Times New Roman" w:hAnsi="Times New Roman" w:cs="Times New Roman"/>
+        </w:rPr>
+        <w:t>motif_decharge</w:t>
+      </w:r>
+      <w:r>
+        <w:rPr>
+          <w:rFonts w:ascii="Times New Roman" w:hAnsi="Times New Roman" w:cs="Times New Roman"/>
+        </w:rPr>
+        <w:t>]</w:t>
+      </w:r>
+      <w:r>
+        <w:rPr>
+          <w:rFonts w:ascii="Times New Roman" w:hAnsi="Times New Roman" w:cs="Times New Roman"/>
+        </w:rPr>
         <w:t xml:space="preserve">  </w:t>
       </w:r>
     </w:p>
@@ -224,7 +977,25 @@
         <w:rPr>
           <w:rFonts w:ascii="Times New Roman" w:hAnsi="Times New Roman" w:cs="Times New Roman"/>
         </w:rPr>
-        <w:t xml:space="preserve">Identifiant de l'utilisateur : </w:t>
+        <w:t>Mode de paiement</w:t>
+      </w:r>
+      <w:r>
+        <w:rPr>
+          <w:rFonts w:ascii="Times New Roman" w:hAnsi="Times New Roman" w:cs="Times New Roman"/>
+        </w:rPr>
+        <w:tab/>
+      </w:r>
+      <w:r>
+        <w:rPr>
+          <w:rFonts w:ascii="Times New Roman" w:hAnsi="Times New Roman" w:cs="Times New Roman"/>
+        </w:rPr>
+        <w:tab/>
+      </w:r>
+      <w:r>
+        <w:rPr>
+          <w:rFonts w:ascii="Times New Roman" w:hAnsi="Times New Roman" w:cs="Times New Roman"/>
+        </w:rPr>
+        <w:t xml:space="preserve">: </w:t>
       </w:r>
       <w:r>
         <w:rPr>
@@ -236,7 +1007,7 @@
         <w:rPr>
           <w:rFonts w:ascii="Times New Roman" w:hAnsi="Times New Roman" w:cs="Times New Roman"/>
         </w:rPr>
-        <w:t>user_decharge_id</w:t>
+        <w:t>mode_paiement</w:t>
       </w:r>
       <w:r>
         <w:rPr>
@@ -248,274 +1019,7 @@
         <w:rPr>
           <w:rFonts w:ascii="Times New Roman" w:hAnsi="Times New Roman" w:cs="Times New Roman"/>
         </w:rPr>
-        <w:t xml:space="preserve">  </w:t>
-      </w:r>
-    </w:p>
-    <w:p>
-      <w:pPr>
-        <w:rPr>
-          <w:rFonts w:ascii="Times New Roman" w:hAnsi="Times New Roman" w:cs="Times New Roman"/>
-        </w:rPr>
-      </w:pPr>
-      <w:r>
-        <w:rPr>
-          <w:rFonts w:ascii="Times New Roman" w:hAnsi="Times New Roman" w:cs="Times New Roman"/>
-        </w:rPr>
-        <w:t xml:space="preserve">Nom d'utilisateur (login)    : </w:t>
-      </w:r>
-      <w:r>
-        <w:rPr>
-          <w:rFonts w:ascii="Times New Roman" w:hAnsi="Times New Roman" w:cs="Times New Roman"/>
-        </w:rPr>
-        <w:t>[</w:t>
-      </w:r>
-      <w:r>
-        <w:rPr>
-          <w:rFonts w:ascii="Times New Roman" w:hAnsi="Times New Roman" w:cs="Times New Roman"/>
-        </w:rPr>
-        <w:t>login_decharge</w:t>
-      </w:r>
-      <w:r>
-        <w:rPr>
-          <w:rFonts w:ascii="Times New Roman" w:hAnsi="Times New Roman" w:cs="Times New Roman"/>
-        </w:rPr>
-        <w:t>]</w:t>
-      </w:r>
-    </w:p>
-    <w:p>
-      <w:pPr>
-        <w:rPr>
-          <w:rFonts w:ascii="Times New Roman" w:hAnsi="Times New Roman" w:cs="Times New Roman"/>
-        </w:rPr>
-      </w:pPr>
-    </w:p>
-    <w:p>
-      <w:pPr>
-        <w:pStyle w:val="Titre2"/>
-      </w:pPr>
-      <w:r>
-        <w:t>INFORMATIONS SUR LE CLIENT / BÉNÉFICIAIRE</w:t>
-      </w:r>
-    </w:p>
-    <w:p>
-      <w:pPr>
-        <w:rPr>
-          <w:rFonts w:ascii="Times New Roman" w:hAnsi="Times New Roman" w:cs="Times New Roman"/>
-        </w:rPr>
-      </w:pPr>
-      <w:r>
-        <w:rPr>
-          <w:rFonts w:ascii="Times New Roman" w:hAnsi="Times New Roman" w:cs="Times New Roman"/>
-        </w:rPr>
-        <w:t xml:space="preserve">Nom et Prénoms du client     : </w:t>
-      </w:r>
-      <w:r>
-        <w:rPr>
-          <w:rFonts w:ascii="Times New Roman" w:hAnsi="Times New Roman" w:cs="Times New Roman"/>
-        </w:rPr>
-        <w:t>[</w:t>
-      </w:r>
-      <w:r>
-        <w:rPr>
-          <w:rFonts w:ascii="Times New Roman" w:hAnsi="Times New Roman" w:cs="Times New Roman"/>
-        </w:rPr>
-        <w:t>nom_prenom_client</w:t>
-      </w:r>
-      <w:r>
-        <w:rPr>
-          <w:rFonts w:ascii="Times New Roman" w:hAnsi="Times New Roman" w:cs="Times New Roman"/>
-        </w:rPr>
-        <w:t>]</w:t>
-      </w:r>
-      <w:r>
-        <w:rPr>
-          <w:rFonts w:ascii="Times New Roman" w:hAnsi="Times New Roman" w:cs="Times New Roman"/>
-        </w:rPr>
-        <w:t xml:space="preserve">  </w:t>
-      </w:r>
-    </w:p>
-    <w:p>
-      <w:pPr>
-        <w:rPr>
-          <w:rFonts w:ascii="Times New Roman" w:hAnsi="Times New Roman" w:cs="Times New Roman"/>
-        </w:rPr>
-      </w:pPr>
-      <w:r>
-        <w:rPr>
-          <w:rFonts w:ascii="Times New Roman" w:hAnsi="Times New Roman" w:cs="Times New Roman"/>
-          <w:lang w:val="fr-FR"/>
-        </w:rPr>
-        <w:t>Téléphone client</w:t>
-      </w:r>
-      <w:r>
-        <w:rPr>
-          <w:rFonts w:ascii="Times New Roman" w:hAnsi="Times New Roman" w:cs="Times New Roman"/>
-        </w:rPr>
-        <w:t xml:space="preserve">    </w:t>
-      </w:r>
-      <w:proofErr w:type="gramStart"/>
-      <w:r>
-        <w:rPr>
-          <w:rFonts w:ascii="Times New Roman" w:hAnsi="Times New Roman" w:cs="Times New Roman"/>
-        </w:rPr>
-        <w:t xml:space="preserve">   :</w:t>
-      </w:r>
-      <w:proofErr w:type="gramEnd"/>
-      <w:r>
-        <w:rPr>
-          <w:rFonts w:ascii="Times New Roman" w:hAnsi="Times New Roman" w:cs="Times New Roman"/>
-        </w:rPr>
         <w:t xml:space="preserve"> </w:t>
-      </w:r>
-      <w:r>
-        <w:rPr>
-          <w:rFonts w:ascii="Times New Roman" w:hAnsi="Times New Roman" w:cs="Times New Roman"/>
-        </w:rPr>
-        <w:t>[</w:t>
-      </w:r>
-      <w:r>
-        <w:rPr>
-          <w:rFonts w:ascii="Times New Roman" w:hAnsi="Times New Roman" w:cs="Times New Roman"/>
-        </w:rPr>
-        <w:t>tel_clt</w:t>
-      </w:r>
-      <w:r>
-        <w:rPr>
-          <w:rFonts w:ascii="Times New Roman" w:hAnsi="Times New Roman" w:cs="Times New Roman"/>
-        </w:rPr>
-        <w:t>]</w:t>
-      </w:r>
-      <w:r>
-        <w:rPr>
-          <w:rFonts w:ascii="Times New Roman" w:hAnsi="Times New Roman" w:cs="Times New Roman"/>
-        </w:rPr>
-        <w:t xml:space="preserve">  </w:t>
-      </w:r>
-    </w:p>
-    <w:p>
-      <w:pPr>
-        <w:rPr>
-          <w:rFonts w:ascii="Times New Roman" w:hAnsi="Times New Roman" w:cs="Times New Roman"/>
-        </w:rPr>
-      </w:pPr>
-    </w:p>
-    <w:p>
-      <w:pPr>
-        <w:pStyle w:val="Titre2"/>
-      </w:pPr>
-      <w:r>
-        <w:t>DÉTAILS DE LA TRANSACTION</w:t>
-      </w:r>
-    </w:p>
-    <w:p>
-      <w:pPr>
-        <w:rPr>
-          <w:rFonts w:ascii="Times New Roman" w:hAnsi="Times New Roman" w:cs="Times New Roman"/>
-        </w:rPr>
-      </w:pPr>
-      <w:r>
-        <w:rPr>
-          <w:rFonts w:ascii="Times New Roman" w:hAnsi="Times New Roman" w:cs="Times New Roman"/>
-        </w:rPr>
-        <w:t xml:space="preserve">Montant déchargé             : </w:t>
-      </w:r>
-      <w:r>
-        <w:rPr>
-          <w:rFonts w:ascii="Times New Roman" w:hAnsi="Times New Roman" w:cs="Times New Roman"/>
-        </w:rPr>
-        <w:t>[</w:t>
-      </w:r>
-      <w:r>
-        <w:rPr>
-          <w:rFonts w:ascii="Times New Roman" w:hAnsi="Times New Roman" w:cs="Times New Roman"/>
-        </w:rPr>
-        <w:t>montant</w:t>
-      </w:r>
-      <w:r>
-        <w:rPr>
-          <w:rFonts w:ascii="Times New Roman" w:hAnsi="Times New Roman" w:cs="Times New Roman"/>
-        </w:rPr>
-        <w:t>]</w:t>
-      </w:r>
-      <w:r>
-        <w:rPr>
-          <w:rFonts w:ascii="Times New Roman" w:hAnsi="Times New Roman" w:cs="Times New Roman"/>
-        </w:rPr>
-        <w:t xml:space="preserve"> F CFA  </w:t>
-      </w:r>
-    </w:p>
-    <w:p>
-      <w:pPr>
-        <w:rPr>
-          <w:rFonts w:ascii="Times New Roman" w:hAnsi="Times New Roman" w:cs="Times New Roman"/>
-        </w:rPr>
-      </w:pPr>
-      <w:r>
-        <w:rPr>
-          <w:rFonts w:ascii="Times New Roman" w:hAnsi="Times New Roman" w:cs="Times New Roman"/>
-        </w:rPr>
-        <w:t xml:space="preserve">Motif de la décharge         : </w:t>
-      </w:r>
-      <w:r>
-        <w:rPr>
-          <w:rFonts w:ascii="Times New Roman" w:hAnsi="Times New Roman" w:cs="Times New Roman"/>
-        </w:rPr>
-        <w:t>[</w:t>
-      </w:r>
-      <w:r>
-        <w:rPr>
-          <w:rFonts w:ascii="Times New Roman" w:hAnsi="Times New Roman" w:cs="Times New Roman"/>
-        </w:rPr>
-        <w:t>motif_decharge</w:t>
-      </w:r>
-      <w:r>
-        <w:rPr>
-          <w:rFonts w:ascii="Times New Roman" w:hAnsi="Times New Roman" w:cs="Times New Roman"/>
-        </w:rPr>
-        <w:t>]</w:t>
-      </w:r>
-      <w:r>
-        <w:rPr>
-          <w:rFonts w:ascii="Times New Roman" w:hAnsi="Times New Roman" w:cs="Times New Roman"/>
-        </w:rPr>
-        <w:t xml:space="preserve">  </w:t>
-      </w:r>
-    </w:p>
-    <w:p>
-      <w:pPr>
-        <w:rPr>
-          <w:rFonts w:ascii="Times New Roman" w:hAnsi="Times New Roman" w:cs="Times New Roman"/>
-        </w:rPr>
-      </w:pPr>
-      <w:r>
-        <w:rPr>
-          <w:rFonts w:ascii="Times New Roman" w:hAnsi="Times New Roman" w:cs="Times New Roman"/>
-        </w:rPr>
-        <w:t xml:space="preserve">Mode de paiement             : </w:t>
-      </w:r>
-      <w:r>
-        <w:rPr>
-          <w:rFonts w:ascii="Times New Roman" w:hAnsi="Times New Roman" w:cs="Times New Roman"/>
-        </w:rPr>
-        <w:t>[</w:t>
-      </w:r>
-      <w:r>
-        <w:rPr>
-          <w:rFonts w:ascii="Times New Roman" w:hAnsi="Times New Roman" w:cs="Times New Roman"/>
-        </w:rPr>
-        <w:t>mode_paiement</w:t>
-      </w:r>
-      <w:r>
-        <w:rPr>
-          <w:rFonts w:ascii="Times New Roman" w:hAnsi="Times New Roman" w:cs="Times New Roman"/>
-        </w:rPr>
-        <w:t>]</w:t>
-      </w:r>
-      <w:r>
-        <w:rPr>
-          <w:rFonts w:ascii="Times New Roman" w:hAnsi="Times New Roman" w:cs="Times New Roman"/>
-        </w:rPr>
-        <w:t xml:space="preserve"> (ex. Espèces, Chèque, Virement)</w:t>
       </w:r>
     </w:p>
     <w:p>
@@ -575,35 +1079,49 @@
         <w:rPr>
           <w:rFonts w:ascii="Times New Roman" w:hAnsi="Times New Roman" w:cs="Times New Roman"/>
         </w:rPr>
-        <w:t xml:space="preserve">, en qualité d’agent autorisé(e), certifie par la présente avoir </w:t>
-      </w:r>
-      <w:r>
-        <w:rPr>
-          <w:rFonts w:ascii="Times New Roman" w:hAnsi="Times New Roman" w:cs="Times New Roman"/>
-          <w:lang w:val="fr-FR"/>
-        </w:rPr>
-        <w:t>[sens]</w:t>
-      </w:r>
-      <w:r>
-        <w:rPr>
-          <w:rFonts w:ascii="Times New Roman" w:hAnsi="Times New Roman" w:cs="Times New Roman"/>
-          <w:lang w:val="fr-FR"/>
-        </w:rPr>
-        <w:t xml:space="preserve"> </w:t>
-      </w:r>
-      <w:r>
-        <w:rPr>
-          <w:rFonts w:ascii="Times New Roman" w:hAnsi="Times New Roman" w:cs="Times New Roman"/>
-        </w:rPr>
-        <w:t xml:space="preserve">la somme de </w:t>
+        <w:t>, en qualité d</w:t>
+      </w:r>
+      <w:r>
+        <w:rPr>
+          <w:rFonts w:ascii="Times New Roman" w:hAnsi="Times New Roman" w:cs="Times New Roman"/>
+          <w:lang w:val="fr-FR"/>
+        </w:rPr>
+        <w:t xml:space="preserve">e </w:t>
       </w:r>
       <w:r>
         <w:rPr>
           <w:rFonts w:ascii="Times New Roman" w:hAnsi="Times New Roman" w:cs="Times New Roman"/>
           <w:b/>
           <w:bCs/>
-        </w:rPr>
-        <w:t>[</w:t>
+          <w:lang w:val="fr-FR"/>
+        </w:rPr>
+        <w:t>[poste_dechargeur]</w:t>
+      </w:r>
+      <w:r>
+        <w:rPr>
+          <w:rFonts w:ascii="Times New Roman" w:hAnsi="Times New Roman" w:cs="Times New Roman"/>
+        </w:rPr>
+        <w:t xml:space="preserve"> certifie par la présente avoir </w:t>
+      </w:r>
+      <w:r>
+        <w:rPr>
+          <w:rFonts w:ascii="Times New Roman" w:hAnsi="Times New Roman" w:cs="Times New Roman"/>
+          <w:lang w:val="fr-FR"/>
+        </w:rPr>
+        <w:t>[sens]</w:t>
+      </w:r>
+      <w:r>
+        <w:rPr>
+          <w:rFonts w:ascii="Times New Roman" w:hAnsi="Times New Roman" w:cs="Times New Roman"/>
+          <w:lang w:val="fr-FR"/>
+        </w:rPr>
+        <w:t xml:space="preserve"> </w:t>
+      </w:r>
+      <w:r>
+        <w:rPr>
+          <w:rFonts w:ascii="Times New Roman" w:hAnsi="Times New Roman" w:cs="Times New Roman"/>
+        </w:rPr>
+        <w:t xml:space="preserve">la somme de </w:t>
       </w:r>
       <w:r>
         <w:rPr>
@@ -611,7 +1129,7 @@
           <w:b/>
           <w:bCs/>
         </w:rPr>
-        <w:t>montant</w:t>
+        <w:t>[</w:t>
       </w:r>
       <w:r>
         <w:rPr>
@@ -619,7 +1137,7 @@
           <w:b/>
           <w:bCs/>
         </w:rPr>
-        <w:t>]</w:t>
+        <w:t>montant</w:t>
       </w:r>
       <w:r>
         <w:rPr>
@@ -627,13 +1145,7 @@
           <w:b/>
           <w:bCs/>
         </w:rPr>
-        <w:t xml:space="preserve"> francs CFA</w:t>
-      </w:r>
-      <w:r>
-        <w:rPr>
-          <w:rFonts w:ascii="Times New Roman" w:hAnsi="Times New Roman" w:cs="Times New Roman"/>
-        </w:rPr>
-        <w:t xml:space="preserve"> le </w:t>
+        <w:t>]</w:t>
       </w:r>
       <w:r>
         <w:rPr>
@@ -641,7 +1153,13 @@
           <w:b/>
           <w:bCs/>
         </w:rPr>
-        <w:t>[</w:t>
+        <w:t xml:space="preserve"> francs CFA</w:t>
+      </w:r>
+      <w:r>
+        <w:rPr>
+          <w:rFonts w:ascii="Times New Roman" w:hAnsi="Times New Roman" w:cs="Times New Roman"/>
+        </w:rPr>
+        <w:t xml:space="preserve"> le </w:t>
       </w:r>
       <w:r>
         <w:rPr>
@@ -649,7 +1167,7 @@
           <w:b/>
           <w:bCs/>
         </w:rPr>
-        <w:t>date_decharge_formatted</w:t>
+        <w:t>[</w:t>
       </w:r>
       <w:r>
         <w:rPr>
@@ -657,26 +1175,7 @@
           <w:b/>
           <w:bCs/>
         </w:rPr>
-        <w:t>]</w:t>
-      </w:r>
-      <w:r>
-        <w:rPr>
-          <w:rFonts w:ascii="Times New Roman" w:hAnsi="Times New Roman" w:cs="Times New Roman"/>
-        </w:rPr>
-        <w:t xml:space="preserve">, </w:t>
-      </w:r>
-      <w:r>
-        <w:rPr>
-          <w:rFonts w:ascii="Times New Roman" w:hAnsi="Times New Roman" w:cs="Times New Roman"/>
-          <w:lang w:val="fr-FR"/>
-        </w:rPr>
-        <w:t xml:space="preserve">[compte] </w:t>
-      </w:r>
-      <w:r>
-        <w:rPr>
-          <w:rFonts w:ascii="Times New Roman" w:hAnsi="Times New Roman" w:cs="Times New Roman"/>
-        </w:rPr>
-        <w:t xml:space="preserve">client </w:t>
+        <w:t>date_decharge_formatted</w:t>
       </w:r>
       <w:r>
         <w:rPr>
@@ -684,7 +1183,26 @@
           <w:b/>
           <w:bCs/>
         </w:rPr>
-        <w:t>[</w:t>
+        <w:t>]</w:t>
+      </w:r>
+      <w:r>
+        <w:rPr>
+          <w:rFonts w:ascii="Times New Roman" w:hAnsi="Times New Roman" w:cs="Times New Roman"/>
+        </w:rPr>
+        <w:t xml:space="preserve">, </w:t>
+      </w:r>
+      <w:r>
+        <w:rPr>
+          <w:rFonts w:ascii="Times New Roman" w:hAnsi="Times New Roman" w:cs="Times New Roman"/>
+          <w:lang w:val="fr-FR"/>
+        </w:rPr>
+        <w:t xml:space="preserve">[compte] </w:t>
+      </w:r>
+      <w:r>
+        <w:rPr>
+          <w:rFonts w:ascii="Times New Roman" w:hAnsi="Times New Roman" w:cs="Times New Roman"/>
+        </w:rPr>
+        <w:t xml:space="preserve">client </w:t>
       </w:r>
       <w:r>
         <w:rPr>
@@ -692,7 +1210,7 @@
           <w:b/>
           <w:bCs/>
         </w:rPr>
-        <w:t>nom_prenom_client</w:t>
+        <w:t>[</w:t>
       </w:r>
       <w:r>
         <w:rPr>
@@ -700,6 +1218,14 @@
           <w:b/>
           <w:bCs/>
         </w:rPr>
+        <w:t>nom_prenom_client</w:t>
+      </w:r>
+      <w:r>
+        <w:rPr>
+          <w:rFonts w:ascii="Times New Roman" w:hAnsi="Times New Roman" w:cs="Times New Roman"/>
+          <w:b/>
+          <w:bCs/>
+        </w:rPr>
         <w:t>]</w:t>
       </w:r>
       <w:r>
@@ -757,36 +1283,43 @@
       <w:r>
         <w:rPr>
           <w:rFonts w:ascii="Times New Roman" w:hAnsi="Times New Roman" w:cs="Times New Roman"/>
-        </w:rPr>
-        <w:t>Cette opération a été effectuée en toute conformité avec les règles internes de gestion des fonds, et a été</w:t>
-      </w:r>
-      <w:r>
-        <w:rPr>
-          <w:rFonts w:ascii="Times New Roman" w:hAnsi="Times New Roman" w:cs="Times New Roman"/>
-          <w:lang w:val="fr-FR"/>
-        </w:rPr>
-        <w:t xml:space="preserve"> </w:t>
-      </w:r>
-      <w:r>
-        <w:rPr>
-          <w:rFonts w:ascii="Times New Roman" w:hAnsi="Times New Roman" w:cs="Times New Roman"/>
-        </w:rPr>
-        <w:t>immédiatement consignée dans le registre officiel de décharge tenu à jour par le service concerné.</w:t>
-      </w:r>
-    </w:p>
-    <w:p>
-      <w:pPr>
-        <w:spacing w:line="276" w:lineRule="auto"/>
-        <w:jc w:val="both"/>
-        <w:rPr>
-          <w:rFonts w:ascii="Times New Roman" w:hAnsi="Times New Roman" w:cs="Times New Roman"/>
-        </w:rPr>
-      </w:pPr>
-      <w:r>
-        <w:rPr>
-          <w:rFonts w:ascii="Times New Roman" w:hAnsi="Times New Roman" w:cs="Times New Roman"/>
-        </w:rPr>
-        <w:t>Je m'engage à fournir tout justificatif complémentaire en cas d’audit, de contrôle ou de vérification ultérieure.</w:t>
+          <w:lang w:val="fr-FR"/>
+        </w:rPr>
+        <w:t>En foi de quoi j’établi l</w:t>
+      </w:r>
+      <w:r>
+        <w:rPr>
+          <w:rFonts w:ascii="Times New Roman" w:hAnsi="Times New Roman" w:cs="Times New Roman"/>
+          <w:lang w:val="fr-FR"/>
+        </w:rPr>
+        <w:t>a</w:t>
+      </w:r>
+      <w:r>
+        <w:rPr>
+          <w:rFonts w:ascii="Times New Roman" w:hAnsi="Times New Roman" w:cs="Times New Roman"/>
+          <w:lang w:val="fr-FR"/>
+        </w:rPr>
+        <w:t xml:space="preserve"> présent</w:t>
+      </w:r>
+      <w:r>
+        <w:rPr>
+          <w:rFonts w:ascii="Times New Roman" w:hAnsi="Times New Roman" w:cs="Times New Roman"/>
+          <w:lang w:val="fr-FR"/>
+        </w:rPr>
+        <w:t>e</w:t>
+      </w:r>
+      <w:r>
+        <w:rPr>
+          <w:rFonts w:ascii="Times New Roman" w:hAnsi="Times New Roman" w:cs="Times New Roman"/>
+          <w:lang w:val="fr-FR"/>
+        </w:rPr>
+        <w:t xml:space="preserve"> décharge pour servir et valoir ce que de droit</w:t>
+      </w:r>
+      <w:r>
+        <w:rPr>
+          <w:rFonts w:ascii="Times New Roman" w:hAnsi="Times New Roman" w:cs="Times New Roman"/>
+        </w:rPr>
+        <w:t>.</w:t>
       </w:r>
     </w:p>
     <w:p>
@@ -852,79 +1385,266 @@
         <w:rPr>
           <w:rFonts w:ascii="Times New Roman" w:hAnsi="Times New Roman" w:cs="Times New Roman"/>
         </w:rPr>
-        <w:t>Signature du Déchargeur                             Signature du Client</w:t>
-      </w:r>
-    </w:p>
-    <w:p>
-      <w:pPr>
-        <w:rPr>
-          <w:rFonts w:ascii="Times New Roman" w:hAnsi="Times New Roman" w:cs="Times New Roman"/>
-        </w:rPr>
-      </w:pPr>
-    </w:p>
-    <w:p>
-      <w:pPr>
-        <w:rPr>
-          <w:rFonts w:ascii="Times New Roman" w:hAnsi="Times New Roman" w:cs="Times New Roman"/>
-        </w:rPr>
-      </w:pPr>
-      <w:r>
-        <w:rPr>
-          <w:rFonts w:ascii="Times New Roman" w:hAnsi="Times New Roman" w:cs="Times New Roman"/>
-        </w:rPr>
-        <w:t>_________________________                           _________________________</w:t>
-      </w:r>
-    </w:p>
-    <w:p>
-      <w:pPr>
-        <w:rPr>
-          <w:rFonts w:ascii="Times New Roman" w:hAnsi="Times New Roman" w:cs="Times New Roman"/>
-        </w:rPr>
-      </w:pPr>
-    </w:p>
-    <w:p>
-      <w:pPr>
-        <w:rPr>
-          <w:rFonts w:ascii="Times New Roman" w:hAnsi="Times New Roman" w:cs="Times New Roman"/>
-        </w:rPr>
-      </w:pPr>
-    </w:p>
-    <w:p>
-      <w:pPr>
-        <w:rPr>
-          <w:rFonts w:ascii="Times New Roman" w:hAnsi="Times New Roman" w:cs="Times New Roman"/>
-        </w:rPr>
-      </w:pPr>
-      <w:r>
-        <w:rPr>
-          <w:rFonts w:ascii="Times New Roman" w:hAnsi="Times New Roman" w:cs="Times New Roman"/>
-        </w:rPr>
-        <w:t>Cachet du Service                                    Visa du Responsable</w:t>
-      </w:r>
-    </w:p>
-    <w:p>
-      <w:pPr>
-        <w:rPr>
-          <w:rFonts w:ascii="Times New Roman" w:hAnsi="Times New Roman" w:cs="Times New Roman"/>
-        </w:rPr>
-      </w:pPr>
-    </w:p>
-    <w:p>
-      <w:pPr>
-        <w:rPr>
-          <w:rFonts w:ascii="Times New Roman" w:hAnsi="Times New Roman" w:cs="Times New Roman"/>
-        </w:rPr>
-      </w:pPr>
-      <w:r>
-        <w:rPr>
-          <w:rFonts w:ascii="Times New Roman" w:hAnsi="Times New Roman" w:cs="Times New Roman"/>
-        </w:rPr>
-        <w:t>_________________________                           _________________________</w:t>
+        <w:t>Signature du Déchargeur</w:t>
+      </w:r>
+      <w:r>
+        <w:rPr>
+          <w:rFonts w:ascii="Times New Roman" w:hAnsi="Times New Roman" w:cs="Times New Roman"/>
+        </w:rPr>
+        <w:tab/>
+      </w:r>
+      <w:r>
+        <w:rPr>
+          <w:rFonts w:ascii="Times New Roman" w:hAnsi="Times New Roman" w:cs="Times New Roman"/>
+        </w:rPr>
+        <w:tab/>
+      </w:r>
+      <w:r>
+        <w:rPr>
+          <w:rFonts w:ascii="Times New Roman" w:hAnsi="Times New Roman" w:cs="Times New Roman"/>
+        </w:rPr>
+        <w:tab/>
+      </w:r>
+      <w:r>
+        <w:rPr>
+          <w:rFonts w:ascii="Times New Roman" w:hAnsi="Times New Roman" w:cs="Times New Roman"/>
+        </w:rPr>
+        <w:tab/>
+      </w:r>
+      <w:r>
+        <w:rPr>
+          <w:rFonts w:ascii="Times New Roman" w:hAnsi="Times New Roman" w:cs="Times New Roman"/>
+        </w:rPr>
+        <w:t>Signature du Client</w:t>
+      </w:r>
+    </w:p>
+    <w:p>
+      <w:pPr>
+        <w:rPr>
+          <w:rFonts w:ascii="Times New Roman" w:hAnsi="Times New Roman" w:cs="Times New Roman"/>
+        </w:rPr>
+      </w:pPr>
+    </w:p>
+    <w:p>
+      <w:pPr>
+        <w:rPr>
+          <w:rFonts w:ascii="Times New Roman" w:hAnsi="Times New Roman" w:cs="Times New Roman"/>
+        </w:rPr>
+      </w:pPr>
+      <w:r>
+        <w:rPr>
+          <w:rFonts w:ascii="Times New Roman" w:hAnsi="Times New Roman" w:cs="Times New Roman"/>
+        </w:rPr>
+        <w:t>_________________________</w:t>
+      </w:r>
+      <w:r>
+        <w:rPr>
+          <w:rFonts w:ascii="Times New Roman" w:hAnsi="Times New Roman" w:cs="Times New Roman"/>
+        </w:rPr>
+        <w:tab/>
+      </w:r>
+      <w:r>
+        <w:rPr>
+          <w:rFonts w:ascii="Times New Roman" w:hAnsi="Times New Roman" w:cs="Times New Roman"/>
+        </w:rPr>
+        <w:tab/>
+      </w:r>
+      <w:r>
+        <w:rPr>
+          <w:rFonts w:ascii="Times New Roman" w:hAnsi="Times New Roman" w:cs="Times New Roman"/>
+        </w:rPr>
+        <w:tab/>
+      </w:r>
+      <w:r>
+        <w:rPr>
+          <w:rFonts w:ascii="Times New Roman" w:hAnsi="Times New Roman" w:cs="Times New Roman"/>
+        </w:rPr>
+        <w:t>_________________________</w:t>
+      </w:r>
+    </w:p>
+    <w:p>
+      <w:pPr>
+        <w:rPr>
+          <w:rFonts w:ascii="Times New Roman" w:hAnsi="Times New Roman" w:cs="Times New Roman"/>
+        </w:rPr>
+      </w:pPr>
+    </w:p>
+    <w:p>
+      <w:pPr>
+        <w:rPr>
+          <w:rFonts w:ascii="Times New Roman" w:hAnsi="Times New Roman" w:cs="Times New Roman"/>
+        </w:rPr>
+      </w:pPr>
+    </w:p>
+    <w:p>
+      <w:pPr>
+        <w:rPr>
+          <w:rFonts w:ascii="Times New Roman" w:hAnsi="Times New Roman" w:cs="Times New Roman"/>
+        </w:rPr>
+      </w:pPr>
+    </w:p>
+    <w:p>
+      <w:pPr>
+        <w:rPr>
+          <w:rFonts w:ascii="Times New Roman" w:hAnsi="Times New Roman" w:cs="Times New Roman"/>
+        </w:rPr>
+      </w:pPr>
+    </w:p>
+    <w:p>
+      <w:pPr>
+        <w:rPr>
+          <w:rFonts w:ascii="Times New Roman" w:hAnsi="Times New Roman" w:cs="Times New Roman"/>
+        </w:rPr>
+      </w:pPr>
+      <w:r>
+        <w:rPr>
+          <w:rFonts w:ascii="Times New Roman" w:hAnsi="Times New Roman" w:cs="Times New Roman"/>
+        </w:rPr>
+        <w:t xml:space="preserve">_________________________ </w:t>
+      </w:r>
+      <w:r>
+        <w:rPr>
+          <w:rFonts w:ascii="Times New Roman" w:hAnsi="Times New Roman" w:cs="Times New Roman"/>
+        </w:rPr>
+        <w:tab/>
+      </w:r>
+      <w:r>
+        <w:rPr>
+          <w:rFonts w:ascii="Times New Roman" w:hAnsi="Times New Roman" w:cs="Times New Roman"/>
+        </w:rPr>
+        <w:tab/>
+      </w:r>
+      <w:r>
+        <w:rPr>
+          <w:rFonts w:ascii="Times New Roman" w:hAnsi="Times New Roman" w:cs="Times New Roman"/>
+        </w:rPr>
+        <w:tab/>
+      </w:r>
+      <w:r>
+        <w:rPr>
+          <w:rFonts w:ascii="Times New Roman" w:hAnsi="Times New Roman" w:cs="Times New Roman"/>
+        </w:rPr>
+        <w:t>_________________________</w:t>
+      </w:r>
+    </w:p>
+    <w:p>
+      <w:pPr>
+        <w:rPr>
+          <w:rFonts w:ascii="Times New Roman" w:hAnsi="Times New Roman" w:cs="Times New Roman"/>
+          <w:i/>
+          <w:iCs/>
+          <w:lang w:val="fr-FR"/>
+        </w:rPr>
+      </w:pPr>
+      <w:r>
+        <w:rPr>
+          <w:rFonts w:ascii="Times New Roman" w:hAnsi="Times New Roman" w:cs="Times New Roman"/>
+        </w:rPr>
+        <w:tab/>
+      </w:r>
+      <w:r>
+        <w:rPr>
+          <w:rFonts w:ascii="Times New Roman" w:hAnsi="Times New Roman" w:cs="Times New Roman"/>
+        </w:rPr>
+        <w:tab/>
+      </w:r>
+      <w:r>
+        <w:rPr>
+          <w:rFonts w:ascii="Times New Roman" w:hAnsi="Times New Roman" w:cs="Times New Roman"/>
+        </w:rPr>
+        <w:tab/>
+      </w:r>
+      <w:r>
+        <w:rPr>
+          <w:rFonts w:ascii="Times New Roman" w:hAnsi="Times New Roman" w:cs="Times New Roman"/>
+        </w:rPr>
+        <w:tab/>
+      </w:r>
+      <w:r>
+        <w:rPr>
+          <w:rFonts w:ascii="Times New Roman" w:hAnsi="Times New Roman" w:cs="Times New Roman"/>
+        </w:rPr>
+        <w:tab/>
+      </w:r>
+      <w:r>
+        <w:rPr>
+          <w:rFonts w:ascii="Times New Roman" w:hAnsi="Times New Roman" w:cs="Times New Roman"/>
+        </w:rPr>
+        <w:tab/>
+      </w:r>
+      <w:r>
+        <w:rPr>
+          <w:rFonts w:ascii="Times New Roman" w:hAnsi="Times New Roman" w:cs="Times New Roman"/>
+        </w:rPr>
+        <w:tab/>
+      </w:r>
+      <w:r>
+        <w:rPr>
+          <w:rFonts w:ascii="Times New Roman" w:hAnsi="Times New Roman" w:cs="Times New Roman"/>
+        </w:rPr>
+        <w:tab/>
+      </w:r>
+      <w:r>
+        <w:rPr>
+          <w:rFonts w:ascii="Times New Roman" w:hAnsi="Times New Roman" w:cs="Times New Roman"/>
+        </w:rPr>
+        <w:tab/>
+      </w:r>
+      <w:r>
+        <w:rPr>
+          <w:rFonts w:ascii="Times New Roman" w:hAnsi="Times New Roman" w:cs="Times New Roman"/>
+        </w:rPr>
+        <w:tab/>
+      </w:r>
+      <w:r>
+        <w:rPr>
+          <w:rFonts w:ascii="Times New Roman" w:hAnsi="Times New Roman" w:cs="Times New Roman"/>
+          <w:i/>
+          <w:iCs/>
+          <w:sz w:val="13"/>
+          <w:szCs w:val="13"/>
+          <w:lang w:val="fr-FR"/>
+        </w:rPr>
+        <w:t xml:space="preserve">Imprimer le </w:t>
+      </w:r>
+      <w:r>
+        <w:rPr>
+          <w:rFonts w:ascii="Times New Roman" w:hAnsi="Times New Roman" w:cs="Times New Roman"/>
+          <w:i/>
+          <w:iCs/>
+          <w:sz w:val="13"/>
+          <w:szCs w:val="13"/>
+        </w:rPr>
+        <w:t>[date_</w:t>
+      </w:r>
+      <w:proofErr w:type="spellStart"/>
+      <w:r>
+        <w:rPr>
+          <w:rFonts w:ascii="Times New Roman" w:hAnsi="Times New Roman" w:cs="Times New Roman"/>
+          <w:i/>
+          <w:iCs/>
+          <w:sz w:val="13"/>
+          <w:szCs w:val="13"/>
+          <w:lang w:val="fr-FR"/>
+        </w:rPr>
+        <w:t>imp</w:t>
+      </w:r>
+      <w:proofErr w:type="spellEnd"/>
+      <w:r>
+        <w:rPr>
+          <w:rFonts w:ascii="Times New Roman" w:hAnsi="Times New Roman" w:cs="Times New Roman"/>
+          <w:i/>
+          <w:iCs/>
+          <w:sz w:val="13"/>
+          <w:szCs w:val="13"/>
+        </w:rPr>
+        <w:t>]</w:t>
       </w:r>
     </w:p>
     <w:sectPr>
+      <w:headerReference w:type="default" r:id="rId6"/>
       <w:pgSz w:w="11906" w:h="16838"/>
-      <w:pgMar w:top="1134" w:right="1440" w:bottom="1134" w:left="1440" w:header="397" w:footer="709" w:gutter="0"/>
+      <w:pgMar w:top="1134" w:right="1440" w:bottom="567" w:left="1440" w:header="57" w:footer="170" w:gutter="0"/>
       <w:cols w:space="708"/>
       <w:docGrid w:linePitch="360"/>
     </w:sectPr>
@@ -968,6 +1688,515 @@
     </w:p>
   </w:footnote>
 </w:footnotes>
+</file>
+
+<file path=word/header1.xml><?xml version="1.0" encoding="utf-8"?>
+<w:hdr xmlns:wpc="http://schemas.microsoft.com/office/word/2010/wordprocessingCanvas" xmlns:cx="http://schemas.microsoft.com/office/drawing/2014/chartex" xmlns:cx1="http://schemas.microsoft.com/office/drawing/2015/9/8/chartex" xmlns:cx2="http://schemas.microsoft.com/office/drawing/2015/10/21/chartex" xmlns:cx3="http://schemas.microsoft.com/office/drawing/2016/5/9/chartex" xmlns:cx4="http://schemas.microsoft.com/office/drawing/2016/5/10/chartex" xmlns:cx5="http://schemas.microsoft.com/office/drawing/2016/5/11/chartex" xmlns:cx6="http://schemas.microsoft.com/office/drawing/2016/5/12/chartex" xmlns:cx7="http://schemas.microsoft.com/office/drawing/2016/5/13/chartex" xmlns:cx8="http://schemas.microsoft.com/office/drawing/2016/5/14/chartex" xmlns:mc="http://schemas.openxmlformats.org/markup-compatibility/2006" xmlns:aink="http://schemas.microsoft.com/office/drawing/2016/ink" xmlns:am3d="http://schemas.microsoft.com/office/drawing/2017/model3d" xmlns:o="urn:schemas-microsoft-com:office:office" xmlns:oel="http://schemas.microsoft.com/office/2019/extlst" xmlns:r="http://schemas.openxmlformats.org/officeDocument/2006/relationships" xmlns:m="http://schemas.openxmlformats.org/officeDocument/2006/math" xmlns:v="urn:schemas-microsoft-com:vml" xmlns:wp14="http://schemas.microsoft.com/office/word/2010/wordprocessingDrawing" xmlns:wp="http://schemas.openxmlformats.org/drawingml/2006/wordprocessingDrawing" xmlns:w10="urn:schemas-microsoft-com:office:word" xmlns:w="http://schemas.openxmlformats.org/wordprocessingml/2006/main" xmlns:w14="http://schemas.microsoft.com/office/word/2010/wordml" xmlns:w15="http://schemas.microsoft.com/office/word/2012/wordml" xmlns:w16cex="http://schemas.microsoft.com/office/word/2018/wordml/cex" xmlns:w16cid="http://schemas.microsoft.com/office/word/2016/wordml/cid" xmlns:w16="http://schemas.microsoft.com/office/word/2018/wordml" xmlns:w16sdtdh="http://schemas.microsoft.com/office/word/2020/wordml/sdtdatahash" xmlns:w16se="http://schemas.microsoft.com/office/word/2015/wordml/symex" xmlns:wpg="http://schemas.microsoft.com/office/word/2010/wordprocessingGroup" xmlns:wpi="http://schemas.microsoft.com/office/word/2010/wordprocessingInk" xmlns:wne="http://schemas.microsoft.com/office/word/2006/wordml" xmlns:wps="http://schemas.microsoft.com/office/word/2010/wordprocessingShape" mc:Ignorable="w14 w15 w16se w16cid w16 w16cex w16sdtdh wp14">
+  <w:p>
+    <w:pPr>
+      <w:pStyle w:val="En-tte"/>
+    </w:pPr>
+    <w:r>
+      <w:rPr>
+        <w:noProof/>
+        <w:lang w:val="en-US"/>
+      </w:rPr>
+      <mc:AlternateContent>
+        <mc:Choice Requires="wps">
+          <w:drawing>
+            <wp:anchor distT="0" distB="0" distL="114300" distR="114300" simplePos="0" relativeHeight="251661312" behindDoc="0" locked="0" layoutInCell="1" allowOverlap="1" wp14:anchorId="265FD33A" wp14:editId="45372459">
+              <wp:simplePos x="0" y="0"/>
+              <wp:positionH relativeFrom="column">
+                <wp:posOffset>2209165</wp:posOffset>
+              </wp:positionH>
+              <wp:positionV relativeFrom="paragraph">
+                <wp:posOffset>7620</wp:posOffset>
+              </wp:positionV>
+              <wp:extent cx="2964180" cy="335280"/>
+              <wp:effectExtent l="0" t="0" r="0" b="7620"/>
+              <wp:wrapNone/>
+              <wp:docPr id="3" name="Zone de texte 3"/>
+              <wp:cNvGraphicFramePr/>
+              <a:graphic xmlns:a="http://schemas.openxmlformats.org/drawingml/2006/main">
+                <a:graphicData uri="http://schemas.microsoft.com/office/word/2010/wordprocessingShape">
+                  <wps:wsp>
+                    <wps:cNvSpPr txBox="1"/>
+                    <wps:spPr>
+                      <a:xfrm>
+                        <a:off x="0" y="0"/>
+                        <a:ext cx="2964180" cy="335280"/>
+                      </a:xfrm>
+                      <a:prstGeom prst="rect">
+                        <a:avLst/>
+                      </a:prstGeom>
+                      <a:noFill/>
+                      <a:ln>
+                        <a:noFill/>
+                      </a:ln>
+                    </wps:spPr>
+                    <wps:txbx>
+                      <w:txbxContent>
+                        <w:p>
+                          <w:pPr>
+                            <w:rPr>
+                              <w:rFonts w:ascii="Arial" w:hAnsi="Arial" w:cs="Arial"/>
+                              <w:b/>
+                              <w:i/>
+                              <w:color w:val="538135" w:themeColor="accent6" w:themeShade="BF"/>
+                            </w:rPr>
+                          </w:pPr>
+                          <w:r>
+                            <w:rPr>
+                              <w:rFonts w:ascii="Arial" w:hAnsi="Arial" w:cs="Arial"/>
+                              <w:b/>
+                              <w:i/>
+                              <w:color w:val="538135" w:themeColor="accent6" w:themeShade="BF"/>
+                            </w:rPr>
+                            <w:t>Votre Partenaire d’affaires !!!</w:t>
+                          </w:r>
+                        </w:p>
+                      </w:txbxContent>
+                    </wps:txbx>
+                    <wps:bodyPr rot="0" spcFirstLastPara="0" vertOverflow="overflow" horzOverflow="overflow" vert="horz" wrap="square" lIns="91440" tIns="45720" rIns="91440" bIns="45720" numCol="1" spcCol="0" rtlCol="0" fromWordArt="0" anchor="t" anchorCtr="0" forceAA="0" compatLnSpc="1">
+                      <a:prstTxWarp prst="textNoShape">
+                        <a:avLst/>
+                      </a:prstTxWarp>
+                      <a:noAutofit/>
+                    </wps:bodyPr>
+                  </wps:wsp>
+                </a:graphicData>
+              </a:graphic>
+              <wp14:sizeRelV relativeFrom="margin">
+                <wp14:pctHeight>0</wp14:pctHeight>
+              </wp14:sizeRelV>
+            </wp:anchor>
+          </w:drawing>
+        </mc:Choice>
+        <mc:Fallback>
+          <w:pict>
+            <v:shapetype w14:anchorId="265FD33A" id="_x0000_t202" coordsize="21600,21600" o:spt="202" path="m,l,21600r21600,l21600,xe">
+              <v:stroke joinstyle="miter"/>
+              <v:path gradientshapeok="t" o:connecttype="rect"/>
+            </v:shapetype>
+            <v:shape id="Zone de texte 3" o:spid="_x0000_s1026" type="#_x0000_t202" style="position:absolute;margin-left:173.95pt;margin-top:.6pt;width:233.4pt;height:26.4pt;z-index:251661312;visibility:visible;mso-wrap-style:square;mso-height-percent:0;mso-wrap-distance-left:9pt;mso-wrap-distance-top:0;mso-wrap-distance-right:9pt;mso-wrap-distance-bottom:0;mso-position-horizontal:absolute;mso-position-horizontal-relative:text;mso-position-vertical:absolute;mso-position-vertical-relative:text;mso-height-percent:0;mso-height-relative:margin;v-text-anchor:top" o:gfxdata="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" filled="f" stroked="f">
+              <v:textbox>
+                <w:txbxContent>
+                  <w:p>
+                    <w:pPr>
+                      <w:rPr>
+                        <w:rFonts w:ascii="Arial" w:hAnsi="Arial" w:cs="Arial"/>
+                        <w:b/>
+                        <w:i/>
+                        <w:color w:val="538135" w:themeColor="accent6" w:themeShade="BF"/>
+                      </w:rPr>
+                    </w:pPr>
+                    <w:r>
+                      <w:rPr>
+                        <w:rFonts w:ascii="Arial" w:hAnsi="Arial" w:cs="Arial"/>
+                        <w:b/>
+                        <w:i/>
+                        <w:color w:val="538135" w:themeColor="accent6" w:themeShade="BF"/>
+                      </w:rPr>
+                      <w:t>Votre Partenaire d’affaires !!!</w:t>
+                    </w:r>
+                  </w:p>
+                </w:txbxContent>
+              </v:textbox>
+            </v:shape>
+          </w:pict>
+        </mc:Fallback>
+      </mc:AlternateContent>
+    </w:r>
+    <w:r>
+      <w:rPr>
+        <w:noProof/>
+        <w:lang w:val="en-US"/>
+      </w:rPr>
+      <mc:AlternateContent>
+        <mc:Choice Requires="wps">
+          <w:drawing>
+            <wp:anchor distT="0" distB="0" distL="114300" distR="114300" simplePos="0" relativeHeight="251659264" behindDoc="0" locked="0" layoutInCell="1" allowOverlap="1" wp14:anchorId="6F7A40B9" wp14:editId="4011E39B">
+              <wp:simplePos x="0" y="0"/>
+              <wp:positionH relativeFrom="column">
+                <wp:posOffset>-648335</wp:posOffset>
+              </wp:positionH>
+              <wp:positionV relativeFrom="paragraph">
+                <wp:posOffset>-213360</wp:posOffset>
+              </wp:positionV>
+              <wp:extent cx="1516380" cy="1219200"/>
+              <wp:effectExtent l="0" t="0" r="7620" b="0"/>
+              <wp:wrapNone/>
+              <wp:docPr id="1" name="Zone de texte 1"/>
+              <wp:cNvGraphicFramePr/>
+              <a:graphic xmlns:a="http://schemas.openxmlformats.org/drawingml/2006/main">
+                <a:graphicData uri="http://schemas.microsoft.com/office/word/2010/wordprocessingShape">
+                  <wps:wsp>
+                    <wps:cNvSpPr txBox="1"/>
+                    <wps:spPr>
+                      <a:xfrm>
+                        <a:off x="0" y="0"/>
+                        <a:ext cx="1516380" cy="1219200"/>
+                      </a:xfrm>
+                      <a:prstGeom prst="rect">
+                        <a:avLst/>
+                      </a:prstGeom>
+                      <a:solidFill>
+                        <a:schemeClr val="lt1"/>
+                      </a:solidFill>
+                      <a:ln w="6350">
+                        <a:noFill/>
+                      </a:ln>
+                    </wps:spPr>
+                    <wps:txbx>
+                      <w:txbxContent>
+                        <w:p>
+                          <w:r>
+                            <w:rPr>
+                              <w:noProof/>
+                              <w:color w:val="000000"/>
+                              <w:lang w:val="en-US"/>
+                            </w:rPr>
+                            <w:drawing>
+                              <wp:inline distT="0" distB="0" distL="0" distR="0" wp14:anchorId="4EE6D4C6" wp14:editId="087D7C96">
+                                <wp:extent cx="1299316" cy="1104900"/>
+                                <wp:effectExtent l="0" t="0" r="0" b="0"/>
+                                <wp:docPr id="2" name="Image 2" descr="C:\Users\LENOVO\Downloads\WhatsApp Image 2022-04-12 at 13.00.03.jpeg"/>
+                                <wp:cNvGraphicFramePr>
+                                  <a:graphicFrameLocks xmlns:a="http://schemas.openxmlformats.org/drawingml/2006/main" noChangeAspect="1"/>
+                                </wp:cNvGraphicFramePr>
+                                <a:graphic xmlns:a="http://schemas.openxmlformats.org/drawingml/2006/main">
+                                  <a:graphicData uri="http://schemas.openxmlformats.org/drawingml/2006/picture">
+                                    <pic:pic xmlns:pic="http://schemas.openxmlformats.org/drawingml/2006/picture">
+                                      <pic:nvPicPr>
+                                        <pic:cNvPr id="0" name="Picture 7" descr="C:\Users\LENOVO\Downloads\WhatsApp Image 2022-04-12 at 13.00.03.jpeg"/>
+                                        <pic:cNvPicPr>
+                                          <a:picLocks noChangeAspect="1" noChangeArrowheads="1"/>
+                                        </pic:cNvPicPr>
+                                      </pic:nvPicPr>
+                                      <pic:blipFill>
+                                        <a:blip r:embed="rId1">
+                                          <a:extLst>
+                                            <a:ext uri="{28A0092B-C50C-407E-A947-70E740481C1C}">
+                                              <a14:useLocalDpi xmlns:a14="http://schemas.microsoft.com/office/drawing/2010/main" val="0"/>
+                                            </a:ext>
+                                          </a:extLst>
+                                        </a:blip>
+                                        <a:srcRect/>
+                                        <a:stretch>
+                                          <a:fillRect/>
+                                        </a:stretch>
+                                      </pic:blipFill>
+                                      <pic:spPr bwMode="auto">
+                                        <a:xfrm>
+                                          <a:off x="0" y="0"/>
+                                          <a:ext cx="1312301" cy="1115942"/>
+                                        </a:xfrm>
+                                        <a:prstGeom prst="rect">
+                                          <a:avLst/>
+                                        </a:prstGeom>
+                                        <a:noFill/>
+                                        <a:ln>
+                                          <a:noFill/>
+                                        </a:ln>
+                                      </pic:spPr>
+                                    </pic:pic>
+                                  </a:graphicData>
+                                </a:graphic>
+                              </wp:inline>
+                            </w:drawing>
+                          </w:r>
+                        </w:p>
+                      </w:txbxContent>
+                    </wps:txbx>
+                    <wps:bodyPr rot="0" spcFirstLastPara="0" vertOverflow="overflow" horzOverflow="overflow" vert="horz" wrap="square" lIns="91440" tIns="45720" rIns="91440" bIns="45720" numCol="1" spcCol="0" rtlCol="0" fromWordArt="0" anchor="t" anchorCtr="0" forceAA="0" compatLnSpc="1">
+                      <a:prstTxWarp prst="textNoShape">
+                        <a:avLst/>
+                      </a:prstTxWarp>
+                      <a:noAutofit/>
+                    </wps:bodyPr>
+                  </wps:wsp>
+                </a:graphicData>
+              </a:graphic>
+              <wp14:sizeRelH relativeFrom="margin">
+                <wp14:pctWidth>0</wp14:pctWidth>
+              </wp14:sizeRelH>
+              <wp14:sizeRelV relativeFrom="margin">
+                <wp14:pctHeight>0</wp14:pctHeight>
+              </wp14:sizeRelV>
+            </wp:anchor>
+          </w:drawing>
+        </mc:Choice>
+        <mc:Fallback>
+          <w:pict>
+            <v:shape w14:anchorId="6F7A40B9" id="Zone de texte 1" o:spid="_x0000_s1027" type="#_x0000_t202" style="position:absolute;margin-left:-51.05pt;margin-top:-16.8pt;width:119.4pt;height:96pt;z-index:251659264;visibility:visible;mso-wrap-style:square;mso-width-percent:0;mso-height-percent:0;mso-wrap-distance-left:9pt;mso-wrap-distance-top:0;mso-wrap-distance-right:9pt;mso-wrap-distance-bottom:0;mso-position-horizontal:absolute;mso-position-horizontal-relative:text;mso-position-vertical:absolute;mso-position-vertical-relative:text;mso-width-percent:0;mso-height-percent:0;mso-width-relative:margin;mso-height-relative:margin;v-text-anchor:top" o:gfxdata="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" fillcolor="white [3201]" stroked="f" strokeweight=".5pt">
+              <v:textbox>
+                <w:txbxContent>
+                  <w:p>
+                    <w:r>
+                      <w:rPr>
+                        <w:noProof/>
+                        <w:color w:val="000000"/>
+                        <w:lang w:val="en-US"/>
+                      </w:rPr>
+                      <w:drawing>
+                        <wp:inline distT="0" distB="0" distL="0" distR="0" wp14:anchorId="4EE6D4C6" wp14:editId="087D7C96">
+                          <wp:extent cx="1299316" cy="1104900"/>
+                          <wp:effectExtent l="0" t="0" r="0" b="0"/>
+                          <wp:docPr id="2" name="Image 2" descr="C:\Users\LENOVO\Downloads\WhatsApp Image 2022-04-12 at 13.00.03.jpeg"/>
+                          <wp:cNvGraphicFramePr>
+                            <a:graphicFrameLocks xmlns:a="http://schemas.openxmlformats.org/drawingml/2006/main" noChangeAspect="1"/>
+                          </wp:cNvGraphicFramePr>
+                          <a:graphic xmlns:a="http://schemas.openxmlformats.org/drawingml/2006/main">
+                            <a:graphicData uri="http://schemas.openxmlformats.org/drawingml/2006/picture">
+                              <pic:pic xmlns:pic="http://schemas.openxmlformats.org/drawingml/2006/picture">
+                                <pic:nvPicPr>
+                                  <pic:cNvPr id="0" name="Picture 7" descr="C:\Users\LENOVO\Downloads\WhatsApp Image 2022-04-12 at 13.00.03.jpeg"/>
+                                  <pic:cNvPicPr>
+                                    <a:picLocks noChangeAspect="1" noChangeArrowheads="1"/>
+                                  </pic:cNvPicPr>
+                                </pic:nvPicPr>
+                                <pic:blipFill>
+                                  <a:blip r:embed="rId2">
+                                    <a:extLst>
+                                      <a:ext uri="{28A0092B-C50C-407E-A947-70E740481C1C}">
+                                        <a14:useLocalDpi xmlns:a14="http://schemas.microsoft.com/office/drawing/2010/main" val="0"/>
+                                      </a:ext>
+                                    </a:extLst>
+                                  </a:blip>
+                                  <a:srcRect/>
+                                  <a:stretch>
+                                    <a:fillRect/>
+                                  </a:stretch>
+                                </pic:blipFill>
+                                <pic:spPr bwMode="auto">
+                                  <a:xfrm>
+                                    <a:off x="0" y="0"/>
+                                    <a:ext cx="1312301" cy="1115942"/>
+                                  </a:xfrm>
+                                  <a:prstGeom prst="rect">
+                                    <a:avLst/>
+                                  </a:prstGeom>
+                                  <a:noFill/>
+                                  <a:ln>
+                                    <a:noFill/>
+                                  </a:ln>
+                                </pic:spPr>
+                              </pic:pic>
+                            </a:graphicData>
+                          </a:graphic>
+                        </wp:inline>
+                      </w:drawing>
+                    </w:r>
+                  </w:p>
+                </w:txbxContent>
+              </v:textbox>
+            </v:shape>
+          </w:pict>
+        </mc:Fallback>
+      </mc:AlternateContent>
+    </w:r>
+  </w:p>
+  <w:p>
+    <w:pPr>
+      <w:pStyle w:val="En-tte"/>
+      <w:tabs>
+        <w:tab w:val="clear" w:pos="4513"/>
+        <w:tab w:val="left" w:pos="2280"/>
+      </w:tabs>
+    </w:pPr>
+    <w:r>
+      <w:tab/>
+    </w:r>
+  </w:p>
+  <w:p>
+    <w:pPr>
+      <w:pStyle w:val="En-tte"/>
+    </w:pPr>
+    <w:r>
+      <w:rPr>
+        <w:noProof/>
+        <w:lang w:val="en-US"/>
+      </w:rPr>
+      <mc:AlternateContent>
+        <mc:Choice Requires="wps">
+          <w:drawing>
+            <wp:anchor distT="0" distB="0" distL="114300" distR="114300" simplePos="0" relativeHeight="251660288" behindDoc="0" locked="0" layoutInCell="1" allowOverlap="1" wp14:anchorId="09558874" wp14:editId="31608722">
+              <wp:simplePos x="0" y="0"/>
+              <wp:positionH relativeFrom="column">
+                <wp:posOffset>799465</wp:posOffset>
+              </wp:positionH>
+              <wp:positionV relativeFrom="paragraph">
+                <wp:posOffset>55245</wp:posOffset>
+              </wp:positionV>
+              <wp:extent cx="5842635" cy="0"/>
+              <wp:effectExtent l="0" t="19050" r="24765" b="19050"/>
+              <wp:wrapNone/>
+              <wp:docPr id="8" name="Connecteur droit 8"/>
+              <wp:cNvGraphicFramePr/>
+              <a:graphic xmlns:a="http://schemas.openxmlformats.org/drawingml/2006/main">
+                <a:graphicData uri="http://schemas.microsoft.com/office/word/2010/wordprocessingShape">
+                  <wps:wsp>
+                    <wps:cNvCnPr/>
+                    <wps:spPr>
+                      <a:xfrm>
+                        <a:off x="0" y="0"/>
+                        <a:ext cx="5842635" cy="0"/>
+                      </a:xfrm>
+                      <a:prstGeom prst="line">
+                        <a:avLst/>
+                      </a:prstGeom>
+                      <a:ln w="38100">
+                        <a:solidFill>
+                          <a:schemeClr val="accent6">
+                            <a:lumMod val="75000"/>
+                          </a:schemeClr>
+                        </a:solidFill>
+                      </a:ln>
+                    </wps:spPr>
+                    <wps:style>
+                      <a:lnRef idx="1">
+                        <a:schemeClr val="accent1"/>
+                      </a:lnRef>
+                      <a:fillRef idx="0">
+                        <a:schemeClr val="accent1"/>
+                      </a:fillRef>
+                      <a:effectRef idx="0">
+                        <a:schemeClr val="accent1"/>
+                      </a:effectRef>
+                      <a:fontRef idx="minor">
+                        <a:schemeClr val="tx1"/>
+                      </a:fontRef>
+                    </wps:style>
+                    <wps:bodyPr/>
+                  </wps:wsp>
+                </a:graphicData>
+              </a:graphic>
+              <wp14:sizeRelH relativeFrom="margin">
+                <wp14:pctWidth>0</wp14:pctWidth>
+              </wp14:sizeRelH>
+              <wp14:sizeRelV relativeFrom="margin">
+                <wp14:pctHeight>0</wp14:pctHeight>
+              </wp14:sizeRelV>
+            </wp:anchor>
+          </w:drawing>
+        </mc:Choice>
+        <mc:Fallback>
+          <w:pict>
+            <v:line w14:anchorId="3DD8CBD8" id="Connecteur droit 8" o:spid="_x0000_s1026" style="position:absolute;z-index:251660288;visibility:visible;mso-wrap-style:square;mso-width-percent:0;mso-height-percent:0;mso-wrap-distance-left:9pt;mso-wrap-distance-top:0;mso-wrap-distance-right:9pt;mso-wrap-distance-bottom:0;mso-position-horizontal:absolute;mso-position-horizontal-relative:text;mso-position-vertical:absolute;mso-position-vertical-relative:text;mso-width-percent:0;mso-height-percent:0;mso-width-relative:margin;mso-height-relative:margin" from="62.95pt,4.35pt" to="523pt,4.35pt" o:gfxdata="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" strokecolor="#538135 [2409]" strokeweight="3pt">
+              <v:stroke joinstyle="miter"/>
+            </v:line>
+          </w:pict>
+        </mc:Fallback>
+      </mc:AlternateContent>
+    </w:r>
+  </w:p>
+  <w:p>
+    <w:pPr>
+      <w:pStyle w:val="En-tte"/>
+    </w:pPr>
+    <w:r>
+      <w:rPr>
+        <w:noProof/>
+        <w:lang w:val="en-US"/>
+      </w:rPr>
+      <mc:AlternateContent>
+        <mc:Choice Requires="wps">
+          <w:drawing>
+            <wp:anchor distT="0" distB="0" distL="114300" distR="114300" simplePos="0" relativeHeight="251662336" behindDoc="0" locked="0" layoutInCell="1" allowOverlap="1" wp14:anchorId="5F2CF7A5" wp14:editId="5B255C0B">
+              <wp:simplePos x="0" y="0"/>
+              <wp:positionH relativeFrom="column">
+                <wp:posOffset>635635</wp:posOffset>
+              </wp:positionH>
+              <wp:positionV relativeFrom="paragraph">
+                <wp:posOffset>128270</wp:posOffset>
+              </wp:positionV>
+              <wp:extent cx="689610" cy="228600"/>
+              <wp:effectExtent l="0" t="0" r="0" b="0"/>
+              <wp:wrapNone/>
+              <wp:docPr id="10" name="Zone de texte 10"/>
+              <wp:cNvGraphicFramePr/>
+              <a:graphic xmlns:a="http://schemas.openxmlformats.org/drawingml/2006/main">
+                <a:graphicData uri="http://schemas.microsoft.com/office/word/2010/wordprocessingShape">
+                  <wps:wsp>
+                    <wps:cNvSpPr txBox="1"/>
+                    <wps:spPr>
+                      <a:xfrm>
+                        <a:off x="0" y="0"/>
+                        <a:ext cx="689610" cy="228600"/>
+                      </a:xfrm>
+                      <a:prstGeom prst="rect">
+                        <a:avLst/>
+                      </a:prstGeom>
+                      <a:noFill/>
+                      <a:ln w="6350">
+                        <a:noFill/>
+                      </a:ln>
+                    </wps:spPr>
+                    <wps:txbx>
+                      <w:txbxContent>
+                        <w:p>
+                          <w:pPr>
+                            <w:rPr>
+                              <w:rFonts w:ascii="Arial" w:hAnsi="Arial" w:cs="Arial"/>
+                              <w:b/>
+                            </w:rPr>
+                          </w:pPr>
+                          <w:r>
+                            <w:rPr>
+                              <w:rFonts w:ascii="Arial" w:hAnsi="Arial" w:cs="Arial"/>
+                              <w:b/>
+                            </w:rPr>
+                            <w:t>SARL</w:t>
+                          </w:r>
+                        </w:p>
+                      </w:txbxContent>
+                    </wps:txbx>
+                    <wps:bodyPr rot="0" spcFirstLastPara="0" vertOverflow="overflow" horzOverflow="overflow" vert="horz" wrap="square" lIns="91440" tIns="45720" rIns="91440" bIns="45720" numCol="1" spcCol="0" rtlCol="0" fromWordArt="0" anchor="t" anchorCtr="0" forceAA="0" compatLnSpc="1">
+                      <a:prstTxWarp prst="textNoShape">
+                        <a:avLst/>
+                      </a:prstTxWarp>
+                      <a:noAutofit/>
+                    </wps:bodyPr>
+                  </wps:wsp>
+                </a:graphicData>
+              </a:graphic>
+            </wp:anchor>
+          </w:drawing>
+        </mc:Choice>
+        <mc:Fallback>
+          <w:pict>
+            <v:shape w14:anchorId="5F2CF7A5" id="Zone de texte 10" o:spid="_x0000_s1028" type="#_x0000_t202" style="position:absolute;margin-left:50.05pt;margin-top:10.1pt;width:54.3pt;height:18pt;z-index:251662336;visibility:visible;mso-wrap-style:square;mso-wrap-distance-left:9pt;mso-wrap-distance-top:0;mso-wrap-distance-right:9pt;mso-wrap-distance-bottom:0;mso-position-horizontal:absolute;mso-position-horizontal-relative:text;mso-position-vertical:absolute;mso-position-vertical-relative:text;v-text-anchor:top" o:gfxdata="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" filled="f" stroked="f" strokeweight=".5pt">
+              <v:textbox>
+                <w:txbxContent>
+                  <w:p>
+                    <w:pPr>
+                      <w:rPr>
+                        <w:rFonts w:ascii="Arial" w:hAnsi="Arial" w:cs="Arial"/>
+                        <w:b/>
+                      </w:rPr>
+                    </w:pPr>
+                    <w:r>
+                      <w:rPr>
+                        <w:rFonts w:ascii="Arial" w:hAnsi="Arial" w:cs="Arial"/>
+                        <w:b/>
+                      </w:rPr>
+                      <w:t>SARL</w:t>
+                    </w:r>
+                  </w:p>
+                </w:txbxContent>
+              </v:textbox>
+            </v:shape>
+          </w:pict>
+        </mc:Fallback>
+      </mc:AlternateContent>
+    </w:r>
+  </w:p>
+  <w:p>
+    <w:pPr>
+      <w:pStyle w:val="En-tte"/>
+    </w:pPr>
+  </w:p>
+</w:hdr>
 </file>
 
 <file path=word/styles.xml><?xml version="1.0" encoding="utf-8"?>
@@ -1419,6 +2648,7 @@
   <w:style w:type="character" w:default="1" w:styleId="Policepardfaut">
     <w:name w:val="Default Paragraph Font"/>
     <w:uiPriority w:val="1"/>
+    <w:semiHidden/>
     <w:unhideWhenUsed/>
   </w:style>
   <w:style w:type="table" w:default="1" w:styleId="TableauNormal">

</xml_diff>